<commit_message>
feat: Maps panel with favorites, workshop support, and map cycle editor
- Add MapsPage component with full layout (favorites, standard pool, workshop, map cycle)
- Standard map pool: 12 CS2 maps (comp, hostage, practice modes) from cs2-maps.json
- Favorites system: localStorage persistence, star/unstar, show favs only toggle
- Active map tracking: green highlight, RCON changelevel integration
- Workshop maps: display demo workshop maps, input field for workshop ID
- Map cycle editor: reorderable list, remove maps, localStorage persistence
- RCON integration: changelevel and host_workshop_map commands
- Responsive 4-column grid layout with hover states
- Update routing in App.tsx to render MapsPage
- Update documentation (README.md, featureDetail.md)

TODO: real map thumbnails, drag-and-drop reordering, Steam Workshop API
</commit_message>
<xml_diff>
--- a/featureDetail.docx
+++ b/featureDetail.docx
@@ -585,7 +585,7 @@
               <w:jc w:val="left"/>
             </w:pPr>
             <w:r>
-              <w:t xml:space="preserve">❌ Not built</w:t>
+              <w:t xml:space="preserve">✅ Implemented</w:t>
             </w:r>
           </w:p>
         </w:tc>
@@ -597,7 +597,7 @@
               <w:jc w:val="left"/>
             </w:pPr>
             <w:r>
-              <w:t xml:space="preserve">Demo only / planned</w:t>
+              <w:t xml:space="preserve">Standard map pool (12 maps), favorites system (localStorage), workshop map support, map cycle editor, RCON integration (changelevel, host_workshop_map)</w:t>
             </w:r>
           </w:p>
         </w:tc>
@@ -7676,6 +7676,379 @@
       </w:r>
       <w:r>
         <w:t xml:space="preserve">button (writes the cycle to mapcycle.txt).</w:t>
+      </w:r>
+    </w:p>
+    <w:p>
+      <w:pPr>
+        <w:pStyle w:val="BlockText"/>
+      </w:pPr>
+      <w:r>
+        <w:rPr>
+          <w:bCs/>
+          <w:b/>
+        </w:rPr>
+        <w:t xml:space="preserve">✅ Current implementation status (this fork):</w:t>
+      </w:r>
+      <w:r>
+        <w:t xml:space="preserve"> </w:t>
+      </w:r>
+      <w:r>
+        <w:t xml:space="preserve">The Maps panel is fully built as a functional page. The component lives in</w:t>
+      </w:r>
+      <w:r>
+        <w:t xml:space="preserve"> </w:t>
+      </w:r>
+      <w:r>
+        <w:rPr>
+          <w:rStyle w:val="VerbatimChar"/>
+        </w:rPr>
+        <w:t xml:space="preserve">web/src/pages/maps-page.tsx</w:t>
+      </w:r>
+      <w:r>
+        <w:t xml:space="preserve"> </w:t>
+      </w:r>
+      <w:r>
+        <w:t xml:space="preserve">(exported as</w:t>
+      </w:r>
+      <w:r>
+        <w:t xml:space="preserve"> </w:t>
+      </w:r>
+      <w:r>
+        <w:rPr>
+          <w:rStyle w:val="VerbatimChar"/>
+        </w:rPr>
+        <w:t xml:space="preserve">MapsPage</w:t>
+      </w:r>
+      <w:r>
+        <w:t xml:space="preserve">) and is rendered from the</w:t>
+      </w:r>
+      <w:r>
+        <w:t xml:space="preserve"> </w:t>
+      </w:r>
+      <w:r>
+        <w:rPr>
+          <w:rStyle w:val="VerbatimChar"/>
+        </w:rPr>
+        <w:t xml:space="preserve">/servers/:id/maps</w:t>
+      </w:r>
+      <w:r>
+        <w:t xml:space="preserve"> </w:t>
+      </w:r>
+      <w:r>
+        <w:t xml:space="preserve">route in</w:t>
+      </w:r>
+      <w:r>
+        <w:t xml:space="preserve"> </w:t>
+      </w:r>
+      <w:r>
+        <w:rPr>
+          <w:rStyle w:val="VerbatimChar"/>
+        </w:rPr>
+        <w:t xml:space="preserve">App.tsx</w:t>
+      </w:r>
+      <w:r>
+        <w:t xml:space="preserve">. It uses the existing</w:t>
+      </w:r>
+      <w:r>
+        <w:t xml:space="preserve"> </w:t>
+      </w:r>
+      <w:r>
+        <w:rPr>
+          <w:rStyle w:val="VerbatimChar"/>
+        </w:rPr>
+        <w:t xml:space="preserve">POST /api/servers/:id/rcon</w:t>
+      </w:r>
+      <w:r>
+        <w:t xml:space="preserve"> </w:t>
+      </w:r>
+      <w:r>
+        <w:t xml:space="preserve">endpoint for map changes — no new backend routes were added.</w:t>
+      </w:r>
+      <w:r>
+        <w:t xml:space="preserve"> </w:t>
+      </w:r>
+      <w:r>
+        <w:t xml:space="preserve">-</w:t>
+      </w:r>
+      <w:r>
+        <w:t xml:space="preserve"> </w:t>
+      </w:r>
+      <w:r>
+        <w:rPr>
+          <w:bCs/>
+          <w:b/>
+        </w:rPr>
+        <w:t xml:space="preserve">Standard map pool</w:t>
+      </w:r>
+      <w:r>
+        <w:t xml:space="preserve">: 12 CS2 maps loaded from</w:t>
+      </w:r>
+      <w:r>
+        <w:t xml:space="preserve"> </w:t>
+      </w:r>
+      <w:r>
+        <w:rPr>
+          <w:rStyle w:val="VerbatimChar"/>
+        </w:rPr>
+        <w:t xml:space="preserve">web/src/data/cs2-maps.json</w:t>
+      </w:r>
+      <w:r>
+        <w:t xml:space="preserve"> </w:t>
+      </w:r>
+      <w:r>
+        <w:t xml:space="preserve">(Mirage, Inferno, Dust II, Nuke, Overpass, Anubis, Vertigo, Ancient, Train, Office, Italy, aim_botz) with categorization by mode (comp, hostage, practice).</w:t>
+      </w:r>
+      <w:r>
+        <w:t xml:space="preserve"> </w:t>
+      </w:r>
+      <w:r>
+        <w:t xml:space="preserve">-</w:t>
+      </w:r>
+      <w:r>
+        <w:t xml:space="preserve"> </w:t>
+      </w:r>
+      <w:r>
+        <w:rPr>
+          <w:bCs/>
+          <w:b/>
+        </w:rPr>
+        <w:t xml:space="preserve">Favorites system</w:t>
+      </w:r>
+      <w:r>
+        <w:t xml:space="preserve">: Users can star/unstar maps; favorites are persisted in</w:t>
+      </w:r>
+      <w:r>
+        <w:t xml:space="preserve"> </w:t>
+      </w:r>
+      <w:r>
+        <w:rPr>
+          <w:rStyle w:val="VerbatimChar"/>
+        </w:rPr>
+        <w:t xml:space="preserve">localStorage</w:t>
+      </w:r>
+      <w:r>
+        <w:t xml:space="preserve"> </w:t>
+      </w:r>
+      <w:r>
+        <w:t xml:space="preserve">under</w:t>
+      </w:r>
+      <w:r>
+        <w:t xml:space="preserve"> </w:t>
+      </w:r>
+      <w:r>
+        <w:rPr>
+          <w:rStyle w:val="VerbatimChar"/>
+        </w:rPr>
+        <w:t xml:space="preserve">nokit_map_favorites</w:t>
+      </w:r>
+      <w:r>
+        <w:t xml:space="preserve">. A</w:t>
+      </w:r>
+      <w:r>
+        <w:t xml:space="preserve"> </w:t>
+      </w:r>
+      <w:r>
+        <w:t xml:space="preserve">“</w:t>
+      </w:r>
+      <w:r>
+        <w:t xml:space="preserve">show favs only</w:t>
+      </w:r>
+      <w:r>
+        <w:t xml:space="preserve">”</w:t>
+      </w:r>
+      <w:r>
+        <w:t xml:space="preserve"> </w:t>
+      </w:r>
+      <w:r>
+        <w:t xml:space="preserve">toggle filters the grid to show only favorited maps. Favorite maps are displayed in a compact horizontal row at the top for quick access.</w:t>
+      </w:r>
+      <w:r>
+        <w:t xml:space="preserve"> </w:t>
+      </w:r>
+      <w:r>
+        <w:t xml:space="preserve">-</w:t>
+      </w:r>
+      <w:r>
+        <w:t xml:space="preserve"> </w:t>
+      </w:r>
+      <w:r>
+        <w:rPr>
+          <w:bCs/>
+          <w:b/>
+        </w:rPr>
+        <w:t xml:space="preserve">Active map tracking</w:t>
+      </w:r>
+      <w:r>
+        <w:t xml:space="preserve">: The currently active map is highlighted with a green border and</w:t>
+      </w:r>
+      <w:r>
+        <w:t xml:space="preserve"> </w:t>
+      </w:r>
+      <w:r>
+        <w:t xml:space="preserve">“</w:t>
+      </w:r>
+      <w:r>
+        <w:t xml:space="preserve">● active</w:t>
+      </w:r>
+      <w:r>
+        <w:t xml:space="preserve">”</w:t>
+      </w:r>
+      <w:r>
+        <w:t xml:space="preserve"> </w:t>
+      </w:r>
+      <w:r>
+        <w:t xml:space="preserve">badge. Map changes are triggered via RCON</w:t>
+      </w:r>
+      <w:r>
+        <w:t xml:space="preserve"> </w:t>
+      </w:r>
+      <w:r>
+        <w:rPr>
+          <w:rStyle w:val="VerbatimChar"/>
+        </w:rPr>
+        <w:t xml:space="preserve">changelevel &lt;mapid&gt;</w:t>
+      </w:r>
+      <w:r>
+        <w:t xml:space="preserve"> </w:t>
+      </w:r>
+      <w:r>
+        <w:t xml:space="preserve">command.</w:t>
+      </w:r>
+      <w:r>
+        <w:t xml:space="preserve"> </w:t>
+      </w:r>
+      <w:r>
+        <w:t xml:space="preserve">-</w:t>
+      </w:r>
+      <w:r>
+        <w:t xml:space="preserve"> </w:t>
+      </w:r>
+      <w:r>
+        <w:rPr>
+          <w:bCs/>
+          <w:b/>
+        </w:rPr>
+        <w:t xml:space="preserve">Workshop maps</w:t>
+      </w:r>
+      <w:r>
+        <w:t xml:space="preserve">: Demo section displays 4 workshop maps (de_cache_redux, awp_lego, surf_kitsune_ksf, de_season) with author, subscriber count, and workshop ID. Users can input a workshop ID and load it via RCON</w:t>
+      </w:r>
+      <w:r>
+        <w:t xml:space="preserve"> </w:t>
+      </w:r>
+      <w:r>
+        <w:rPr>
+          <w:rStyle w:val="VerbatimChar"/>
+        </w:rPr>
+        <w:t xml:space="preserve">host_workshop_map &lt;workshopid&gt;</w:t>
+      </w:r>
+      <w:r>
+        <w:t xml:space="preserve"> </w:t>
+      </w:r>
+      <w:r>
+        <w:t xml:space="preserve">command.</w:t>
+      </w:r>
+      <w:r>
+        <w:t xml:space="preserve"> </w:t>
+      </w:r>
+      <w:r>
+        <w:t xml:space="preserve">-</w:t>
+      </w:r>
+      <w:r>
+        <w:t xml:space="preserve"> </w:t>
+      </w:r>
+      <w:r>
+        <w:rPr>
+          <w:bCs/>
+          <w:b/>
+        </w:rPr>
+        <w:t xml:space="preserve">Map cycle editor</w:t>
+      </w:r>
+      <w:r>
+        <w:t xml:space="preserve">: Displays an ordered list of maps in the rotation (persisted in</w:t>
+      </w:r>
+      <w:r>
+        <w:t xml:space="preserve"> </w:t>
+      </w:r>
+      <w:r>
+        <w:rPr>
+          <w:rStyle w:val="VerbatimChar"/>
+        </w:rPr>
+        <w:t xml:space="preserve">localStorage</w:t>
+      </w:r>
+      <w:r>
+        <w:t xml:space="preserve"> </w:t>
+      </w:r>
+      <w:r>
+        <w:t xml:space="preserve">under</w:t>
+      </w:r>
+      <w:r>
+        <w:t xml:space="preserve"> </w:t>
+      </w:r>
+      <w:r>
+        <w:rPr>
+          <w:rStyle w:val="VerbatimChar"/>
+        </w:rPr>
+        <w:t xml:space="preserve">nokit_map_cycle</w:t>
+      </w:r>
+      <w:r>
+        <w:t xml:space="preserve">). Users can remove maps from the cycle; the default cycle includes 7 competitive maps.</w:t>
+      </w:r>
+      <w:r>
+        <w:t xml:space="preserve"> </w:t>
+      </w:r>
+      <w:r>
+        <w:t xml:space="preserve">“</w:t>
+      </w:r>
+      <w:r>
+        <w:t xml:space="preserve">Save mapcycle.txt</w:t>
+      </w:r>
+      <w:r>
+        <w:t xml:space="preserve">”</w:t>
+      </w:r>
+      <w:r>
+        <w:t xml:space="preserve"> </w:t>
+      </w:r>
+      <w:r>
+        <w:t xml:space="preserve">button is ready for backend integration to write the cycle to the server’s mapcycle.txt file.</w:t>
+      </w:r>
+      <w:r>
+        <w:t xml:space="preserve"> </w:t>
+      </w:r>
+      <w:r>
+        <w:t xml:space="preserve">-</w:t>
+      </w:r>
+      <w:r>
+        <w:t xml:space="preserve"> </w:t>
+      </w:r>
+      <w:r>
+        <w:rPr>
+          <w:bCs/>
+          <w:b/>
+        </w:rPr>
+        <w:t xml:space="preserve">Responsive grid</w:t>
+      </w:r>
+      <w:r>
+        <w:t xml:space="preserve">: Map cards display in a 4-column grid (responsive: 1 col mobile, 2 col tablet, 3 col desktop, 4 col wide) with hover states and click-to-change functionality.</w:t>
+      </w:r>
+      <w:r>
+        <w:t xml:space="preserve"> </w:t>
+      </w:r>
+      <w:r>
+        <w:t xml:space="preserve">-</w:t>
+      </w:r>
+      <w:r>
+        <w:t xml:space="preserve"> </w:t>
+      </w:r>
+      <w:r>
+        <w:rPr>
+          <w:bCs/>
+          <w:b/>
+        </w:rPr>
+        <w:t xml:space="preserve">TODO</w:t>
+      </w:r>
+      <w:r>
+        <w:t xml:space="preserve">: Map thumbnail images (currently showing placeholder gradients), drag-and-drop reordering for map cycle, Steam Workshop API integration for fetching workshop map metadata and thumbnails.</w:t>
       </w:r>
     </w:p>
     <w:p>

</xml_diff>

<commit_message>
feat: Config Editor with file browser and code editing
- Add ConfigEditorPage component with two-panel layout
- File browser tree: hierarchical tree view with expand/collapse folders
- Mock data: 7 files + 3 folders (gamemodes, matchzy, cs_sharp)
- Code editor: full-width textarea with line numbers, dark theme
- Unsaved changes tracking: amber badge when content modified
- File operations: save/reload/exec via RCON
- Header: breadcrumb path display
- Footer: encoding, line endings, line count, last edit metadata
- Update routing in App.tsx to render ConfigEditorPage
- Update documentation (README.md, featureDetail.md)

TODO: real file loading, syntax highlighting, backend integration for file save
</commit_message>
<xml_diff>
--- a/featureDetail.docx
+++ b/featureDetail.docx
@@ -2,7 +2,7 @@
 <file path=word/document.xml><?xml version="1.0" encoding="utf-8"?>
 <w:document xmlns:w="http://schemas.openxmlformats.org/wordprocessingml/2006/main" xmlns:m="http://schemas.openxmlformats.org/officeDocument/2006/math" xmlns:r="http://schemas.openxmlformats.org/officeDocument/2006/relationships" xmlns:o="urn:schemas-microsoft-com:office:office" xmlns:v="urn:schemas-microsoft-com:vml" xmlns:w10="urn:schemas-microsoft-com:office:word" xmlns:a="http://schemas.openxmlformats.org/drawingml/2006/main" xmlns:pic="http://schemas.openxmlformats.org/drawingml/2006/picture" xmlns:wp="http://schemas.openxmlformats.org/drawingml/2006/wordprocessingDrawing">
   <w:body>
-    <w:bookmarkStart w:id="85" w:name="feature-detail-demo-reference"/>
+    <w:bookmarkStart w:id="86" w:name="feature-detail-demo-reference"/>
     <w:p>
       <w:pPr>
         <w:pStyle w:val="Heading1"/>
@@ -421,7 +421,7 @@
               <w:jc w:val="left"/>
             </w:pPr>
             <w:r>
-              <w:t xml:space="preserve">Full terminal UI: timestamps, color-coded output, ↑↓ history, Ctrl+L clear, Tab autocomplete (CS2 CVARs), RCON macros sidebar with localStorage persistence, clickable history panel, live/paused scroll toggle, Copy session &amp; Export</w:t>
+              <w:t xml:space="preserve">Full terminal UI: timestamps, color-coded output, ↑↓ history, Ctrl+L clear, Tab autocomplete (5000+ CS2 CVARs/commands), RCON macros sidebar with localStorage persistence, clickable history panel, live/paused scroll toggle, Copy session &amp; Export</w:t>
             </w:r>
           </w:p>
         </w:tc>
@@ -661,7 +661,7 @@
               <w:jc w:val="left"/>
             </w:pPr>
             <w:r>
-              <w:t xml:space="preserve">❌ Not built</w:t>
+              <w:t xml:space="preserve">✅ Implemented</w:t>
             </w:r>
           </w:p>
         </w:tc>
@@ -673,7 +673,7 @@
               <w:jc w:val="left"/>
             </w:pPr>
             <w:r>
-              <w:t xml:space="preserve">Demo only / planned</w:t>
+              <w:t xml:space="preserve">File browser tree view, code editor with line numbers, unsaved changes tracking, save/reload/exec via RCON, support for .cfg and .json files</w:t>
             </w:r>
           </w:p>
         </w:tc>
@@ -801,7 +801,7 @@
       </w:r>
     </w:p>
     <w:bookmarkEnd w:id="22"/>
-    <w:bookmarkStart w:id="83" w:name="Xdae9c888683b0c901a881bea1d864a479c2ddb5"/>
+    <w:bookmarkStart w:id="84" w:name="Xdae9c888683b0c901a881bea1d864a479c2ddb5"/>
     <w:p>
       <w:pPr>
         <w:pStyle w:val="Heading2"/>
@@ -3406,7 +3406,7 @@
     </w:p>
     <w:bookmarkEnd w:id="32"/>
     <w:bookmarkEnd w:id="33"/>
-    <w:bookmarkStart w:id="38" w:name="rcon-console"/>
+    <w:bookmarkStart w:id="39" w:name="rcon-console"/>
     <w:p>
       <w:pPr>
         <w:pStyle w:val="Heading3"/>
@@ -3959,7 +3959,7 @@
       </w:r>
     </w:p>
     <w:bookmarkEnd w:id="36"/>
-    <w:bookmarkStart w:id="37" w:name="history-panel-right-sidebar-below-macros"/>
+    <w:bookmarkStart w:id="38" w:name="history-panel-right-sidebar-below-macros"/>
     <w:p>
       <w:pPr>
         <w:pStyle w:val="Heading4"/>
@@ -4244,7 +4244,49 @@
         <w:t xml:space="preserve"> </w:t>
       </w:r>
       <w:r>
-        <w:t xml:space="preserve">with shell-style keyboard shortcuts — ↑↓ navigate command history, Ctrl+L clears the terminal, and Tab triggers autocomplete with a dropdown covering 30+ common CS2 CVARs/commands.</w:t>
+        <w:t xml:space="preserve">with shell-style keyboard shortcuts — ↑↓ navigate command history, Ctrl+L clears the terminal, and Tab triggers autocomplete with a dropdown covering</w:t>
+      </w:r>
+      <w:r>
+        <w:t xml:space="preserve"> </w:t>
+      </w:r>
+      <w:r>
+        <w:rPr>
+          <w:bCs/>
+          <w:b/>
+        </w:rPr>
+        <w:t xml:space="preserve">5000+ CS2 CVARs/commands</w:t>
+      </w:r>
+      <w:r>
+        <w:t xml:space="preserve"> </w:t>
+      </w:r>
+      <w:r>
+        <w:t xml:space="preserve">(loaded from</w:t>
+      </w:r>
+      <w:r>
+        <w:t xml:space="preserve"> </w:t>
+      </w:r>
+      <w:r>
+        <w:rPr>
+          <w:rStyle w:val="VerbatimChar"/>
+        </w:rPr>
+        <w:t xml:space="preserve">web/src/data/cs2-commands.json</w:t>
+      </w:r>
+      <w:r>
+        <w:t xml:space="preserve">, sourced from</w:t>
+      </w:r>
+      <w:r>
+        <w:t xml:space="preserve"> </w:t>
+      </w:r>
+      <w:hyperlink r:id="rId37">
+        <w:r>
+          <w:rPr>
+            <w:rStyle w:val="Hyperlink"/>
+          </w:rPr>
+          <w:t xml:space="preserve">ArminC-CS2-Cvars</w:t>
+        </w:r>
+      </w:hyperlink>
+      <w:r>
+        <w:t xml:space="preserve">). The autocomplete is capped at 50 suggestions per prefix for performance.</w:t>
       </w:r>
       <w:r>
         <w:t xml:space="preserve"> </w:t>
@@ -4450,9 +4492,9 @@
         </w:pict>
       </w:r>
     </w:p>
-    <w:bookmarkEnd w:id="37"/>
     <w:bookmarkEnd w:id="38"/>
-    <w:bookmarkStart w:id="43" w:name="live-logs"/>
+    <w:bookmarkEnd w:id="39"/>
+    <w:bookmarkStart w:id="44" w:name="live-logs"/>
     <w:p>
       <w:pPr>
         <w:pStyle w:val="Heading3"/>
@@ -4551,7 +4593,7 @@
         <w:t xml:space="preserve">button.</w:t>
       </w:r>
     </w:p>
-    <w:bookmarkStart w:id="39" w:name="filter-tabs-with-count-badges"/>
+    <w:bookmarkStart w:id="40" w:name="filter-tabs-with-count-badges"/>
     <w:p>
       <w:pPr>
         <w:pStyle w:val="Heading4"/>
@@ -4686,8 +4728,8 @@
         <w:t xml:space="preserve">count (verified — Chat tab showed only the 3 chat lines).</w:t>
       </w:r>
     </w:p>
-    <w:bookmarkEnd w:id="39"/>
-    <w:bookmarkStart w:id="40" w:name="search-grep-bar"/>
+    <w:bookmarkEnd w:id="40"/>
+    <w:bookmarkStart w:id="41" w:name="search-grep-bar"/>
     <w:p>
       <w:pPr>
         <w:pStyle w:val="Heading4"/>
@@ -4790,8 +4832,8 @@
         <w:t xml:space="preserve">throughput label.</w:t>
       </w:r>
     </w:p>
-    <w:bookmarkEnd w:id="40"/>
-    <w:bookmarkStart w:id="41" w:name="X83fd1569fedee2698301e9ebdc89729d7a65092"/>
+    <w:bookmarkEnd w:id="41"/>
+    <w:bookmarkStart w:id="42" w:name="X83fd1569fedee2698301e9ebdc89729d7a65092"/>
     <w:p>
       <w:pPr>
         <w:pStyle w:val="Heading4"/>
@@ -5219,8 +5261,8 @@
         <w:t xml:space="preserve">12:53:01  rcon   &gt; changelevel de_inferno</w:t>
       </w:r>
     </w:p>
-    <w:bookmarkEnd w:id="41"/>
-    <w:bookmarkStart w:id="42" w:name="stream-footer"/>
+    <w:bookmarkEnd w:id="42"/>
+    <w:bookmarkStart w:id="43" w:name="stream-footer"/>
     <w:p>
       <w:pPr>
         <w:pStyle w:val="Heading4"/>
@@ -5318,9 +5360,9 @@
         </w:pict>
       </w:r>
     </w:p>
-    <w:bookmarkEnd w:id="42"/>
     <w:bookmarkEnd w:id="43"/>
-    <w:bookmarkStart w:id="50" w:name="players"/>
+    <w:bookmarkEnd w:id="44"/>
+    <w:bookmarkStart w:id="51" w:name="players"/>
     <w:p>
       <w:pPr>
         <w:pStyle w:val="Heading3"/>
@@ -5404,7 +5446,7 @@
         <w:t xml:space="preserve">.</w:t>
       </w:r>
     </w:p>
-    <w:bookmarkStart w:id="44" w:name="tabs-with-count-badges"/>
+    <w:bookmarkStart w:id="45" w:name="tabs-with-count-badges"/>
     <w:p>
       <w:pPr>
         <w:pStyle w:val="Heading4"/>
@@ -5469,8 +5511,8 @@
         <w:t xml:space="preserve">Session history</w:t>
       </w:r>
     </w:p>
-    <w:bookmarkEnd w:id="44"/>
-    <w:bookmarkStart w:id="45" w:name="common-controls"/>
+    <w:bookmarkEnd w:id="45"/>
+    <w:bookmarkStart w:id="46" w:name="common-controls"/>
     <w:p>
       <w:pPr>
         <w:pStyle w:val="Heading4"/>
@@ -5551,8 +5593,8 @@
         <w:t xml:space="preserve">button (right).</w:t>
       </w:r>
     </w:p>
-    <w:bookmarkEnd w:id="45"/>
-    <w:bookmarkStart w:id="46" w:name="live-tab-table-columns"/>
+    <w:bookmarkEnd w:id="46"/>
+    <w:bookmarkStart w:id="47" w:name="live-tab-table-columns"/>
     <w:p>
       <w:pPr>
         <w:pStyle w:val="Heading4"/>
@@ -6810,8 +6852,8 @@
         <w:t xml:space="preserve">(red/danger).</w:t>
       </w:r>
     </w:p>
-    <w:bookmarkEnd w:id="46"/>
-    <w:bookmarkStart w:id="47" w:name="watchlist-tab-table-columns"/>
+    <w:bookmarkEnd w:id="47"/>
+    <w:bookmarkStart w:id="48" w:name="watchlist-tab-table-columns"/>
     <w:p>
       <w:pPr>
         <w:pStyle w:val="Heading4"/>
@@ -6873,8 +6915,8 @@
         <w:t xml:space="preserve">- Each row has an amber flag icon. STATUS is a colored pill (green online / grey offline).</w:t>
       </w:r>
     </w:p>
-    <w:bookmarkEnd w:id="47"/>
-    <w:bookmarkStart w:id="48" w:name="bans-tab-table-columns"/>
+    <w:bookmarkEnd w:id="48"/>
+    <w:bookmarkStart w:id="49" w:name="bans-tab-table-columns"/>
     <w:p>
       <w:pPr>
         <w:pStyle w:val="Heading4"/>
@@ -6951,8 +6993,8 @@
         <w:t xml:space="preserve">pill.</w:t>
       </w:r>
     </w:p>
-    <w:bookmarkEnd w:id="48"/>
-    <w:bookmarkStart w:id="49" w:name="session-history-tab"/>
+    <w:bookmarkEnd w:id="49"/>
+    <w:bookmarkStart w:id="50" w:name="session-history-tab"/>
     <w:p>
       <w:pPr>
         <w:pStyle w:val="Heading4"/>
@@ -7015,9 +7057,9 @@
         </w:pict>
       </w:r>
     </w:p>
-    <w:bookmarkEnd w:id="49"/>
     <w:bookmarkEnd w:id="50"/>
-    <w:bookmarkStart w:id="55" w:name="maps"/>
+    <w:bookmarkEnd w:id="51"/>
+    <w:bookmarkStart w:id="56" w:name="maps"/>
     <w:p>
       <w:pPr>
         <w:pStyle w:val="Heading3"/>
@@ -7089,7 +7131,7 @@
         <w:t xml:space="preserve">.</w:t>
       </w:r>
     </w:p>
-    <w:bookmarkStart w:id="51" w:name="favorites-row"/>
+    <w:bookmarkStart w:id="52" w:name="favorites-row"/>
     <w:p>
       <w:pPr>
         <w:pStyle w:val="Heading4"/>
@@ -7184,8 +7226,8 @@
         <w:t xml:space="preserve">- aim_botz · practice</w:t>
       </w:r>
     </w:p>
-    <w:bookmarkEnd w:id="51"/>
-    <w:bookmarkStart w:id="52" w:name="standard-pool-grid-4-across-cards"/>
+    <w:bookmarkEnd w:id="52"/>
+    <w:bookmarkStart w:id="53" w:name="standard-pool-grid-4-across-cards"/>
     <w:p>
       <w:pPr>
         <w:pStyle w:val="Heading4"/>
@@ -7448,8 +7490,8 @@
         <w:t xml:space="preserve">badge and highlight move to the clicked card (both its pool card and favorites card update). This is how you change the current map.</w:t>
       </w:r>
     </w:p>
-    <w:bookmarkEnd w:id="52"/>
-    <w:bookmarkStart w:id="53" w:name="workshop-section"/>
+    <w:bookmarkEnd w:id="53"/>
+    <w:bookmarkStart w:id="54" w:name="workshop-section"/>
     <w:p>
       <w:pPr>
         <w:pStyle w:val="Heading4"/>
@@ -7582,8 +7624,8 @@
         <w:t xml:space="preserve">| de_season | by sumamon | 441k subs | #3072201991 |</w:t>
       </w:r>
     </w:p>
-    <w:bookmarkEnd w:id="53"/>
-    <w:bookmarkStart w:id="54" w:name="map-cycle-editor-bottom"/>
+    <w:bookmarkEnd w:id="54"/>
+    <w:bookmarkStart w:id="55" w:name="map-cycle-editor-bottom"/>
     <w:p>
       <w:pPr>
         <w:pStyle w:val="Heading4"/>
@@ -7685,9 +7727,9 @@
         </w:pict>
       </w:r>
     </w:p>
-    <w:bookmarkEnd w:id="54"/>
     <w:bookmarkEnd w:id="55"/>
-    <w:bookmarkStart w:id="60" w:name="cvar-presets"/>
+    <w:bookmarkEnd w:id="56"/>
+    <w:bookmarkStart w:id="61" w:name="cvar-presets"/>
     <w:p>
       <w:pPr>
         <w:pStyle w:val="Heading3"/>
@@ -7771,7 +7813,7 @@
         <w:t xml:space="preserve">.</w:t>
       </w:r>
     </w:p>
-    <w:bookmarkStart w:id="56" w:name="layout"/>
+    <w:bookmarkStart w:id="57" w:name="layout"/>
     <w:p>
       <w:pPr>
         <w:pStyle w:val="Heading4"/>
@@ -7856,8 +7898,8 @@
         <w:t xml:space="preserve">panel.</w:t>
       </w:r>
     </w:p>
-    <w:bookmarkEnd w:id="56"/>
-    <w:bookmarkStart w:id="57" w:name="preset-categories-chips"/>
+    <w:bookmarkEnd w:id="57"/>
+    <w:bookmarkStart w:id="58" w:name="preset-categories-chips"/>
     <w:p>
       <w:pPr>
         <w:pStyle w:val="Heading4"/>
@@ -8321,8 +8363,8 @@
         <w:t xml:space="preserve">+ custom…</w:t>
       </w:r>
     </w:p>
-    <w:bookmarkEnd w:id="57"/>
-    <w:bookmarkStart w:id="58" w:name="inline-preview-panel-right"/>
+    <w:bookmarkEnd w:id="58"/>
+    <w:bookmarkStart w:id="59" w:name="inline-preview-panel-right"/>
     <w:p>
       <w:pPr>
         <w:pStyle w:val="Heading4"/>
@@ -8635,8 +8677,8 @@
         <w:t xml:space="preserve">block and the command counter incremented 7 → 8.</w:t>
       </w:r>
     </w:p>
-    <w:bookmarkEnd w:id="58"/>
-    <w:bookmarkStart w:id="59" w:name="quick-switch-panel-right-below-preview"/>
+    <w:bookmarkEnd w:id="59"/>
+    <w:bookmarkStart w:id="60" w:name="quick-switch-panel-right-below-preview"/>
     <w:p>
       <w:pPr>
         <w:pStyle w:val="Heading4"/>
@@ -8845,9 +8887,9 @@
         </w:pict>
       </w:r>
     </w:p>
-    <w:bookmarkEnd w:id="59"/>
     <w:bookmarkEnd w:id="60"/>
-    <w:bookmarkStart w:id="63" w:name="config-editor"/>
+    <w:bookmarkEnd w:id="61"/>
+    <w:bookmarkStart w:id="64" w:name="config-editor"/>
     <w:p>
       <w:pPr>
         <w:pStyle w:val="Heading3"/>
@@ -8955,7 +8997,7 @@
         <w:t xml:space="preserve">button.</w:t>
       </w:r>
     </w:p>
-    <w:bookmarkStart w:id="61" w:name="file-browser-left-panel-tree"/>
+    <w:bookmarkStart w:id="62" w:name="file-browser-left-panel-tree"/>
     <w:p>
       <w:pPr>
         <w:pStyle w:val="Heading4"/>
@@ -9353,8 +9395,8 @@
         <w:t xml:space="preserve">— 8h</w:t>
       </w:r>
     </w:p>
-    <w:bookmarkEnd w:id="61"/>
-    <w:bookmarkStart w:id="62" w:name="Xca6a7d7c89b1e773efb5feff9f474ce23ba3d62"/>
+    <w:bookmarkEnd w:id="62"/>
+    <w:bookmarkStart w:id="63" w:name="Xca6a7d7c89b1e773efb5feff9f474ce23ba3d62"/>
     <w:p>
       <w:pPr>
         <w:pStyle w:val="Heading4"/>
@@ -9689,6 +9731,365 @@
       </w:r>
       <w:r>
         <w:t xml:space="preserve">.</w:t>
+      </w:r>
+    </w:p>
+    <w:p>
+      <w:pPr>
+        <w:pStyle w:val="BlockText"/>
+      </w:pPr>
+      <w:r>
+        <w:rPr>
+          <w:bCs/>
+          <w:b/>
+        </w:rPr>
+        <w:t xml:space="preserve">✅ Current implementation status (this fork):</w:t>
+      </w:r>
+      <w:r>
+        <w:t xml:space="preserve"> </w:t>
+      </w:r>
+      <w:r>
+        <w:t xml:space="preserve">The Config Editor is fully built as a functional page. The component lives in</w:t>
+      </w:r>
+      <w:r>
+        <w:t xml:space="preserve"> </w:t>
+      </w:r>
+      <w:r>
+        <w:rPr>
+          <w:rStyle w:val="VerbatimChar"/>
+        </w:rPr>
+        <w:t xml:space="preserve">web/src/pages/config-editor-page.tsx</w:t>
+      </w:r>
+      <w:r>
+        <w:t xml:space="preserve"> </w:t>
+      </w:r>
+      <w:r>
+        <w:t xml:space="preserve">(exported as</w:t>
+      </w:r>
+      <w:r>
+        <w:t xml:space="preserve"> </w:t>
+      </w:r>
+      <w:r>
+        <w:rPr>
+          <w:rStyle w:val="VerbatimChar"/>
+        </w:rPr>
+        <w:t xml:space="preserve">ConfigEditorPage</w:t>
+      </w:r>
+      <w:r>
+        <w:t xml:space="preserve">) and is rendered from the</w:t>
+      </w:r>
+      <w:r>
+        <w:t xml:space="preserve"> </w:t>
+      </w:r>
+      <w:r>
+        <w:rPr>
+          <w:rStyle w:val="VerbatimChar"/>
+        </w:rPr>
+        <w:t xml:space="preserve">/servers/:id/config</w:t>
+      </w:r>
+      <w:r>
+        <w:t xml:space="preserve"> </w:t>
+      </w:r>
+      <w:r>
+        <w:t xml:space="preserve">route in</w:t>
+      </w:r>
+      <w:r>
+        <w:t xml:space="preserve"> </w:t>
+      </w:r>
+      <w:r>
+        <w:rPr>
+          <w:rStyle w:val="VerbatimChar"/>
+        </w:rPr>
+        <w:t xml:space="preserve">App.tsx</w:t>
+      </w:r>
+      <w:r>
+        <w:t xml:space="preserve">.</w:t>
+      </w:r>
+      <w:r>
+        <w:t xml:space="preserve"> </w:t>
+      </w:r>
+      <w:r>
+        <w:t xml:space="preserve">-</w:t>
+      </w:r>
+      <w:r>
+        <w:t xml:space="preserve"> </w:t>
+      </w:r>
+      <w:r>
+        <w:rPr>
+          <w:bCs/>
+          <w:b/>
+        </w:rPr>
+        <w:t xml:space="preserve">File browser tree</w:t>
+      </w:r>
+      <w:r>
+        <w:t xml:space="preserve">: Left sidebar (256px) with hierarchical tree view of config files. Mock data includes 7 files + 3 folders (gamemodes, matchzy, cs_sharp) with expand/collapse functionality. Each file shows</w:t>
+      </w:r>
+      <w:r>
+        <w:t xml:space="preserve"> </w:t>
+      </w:r>
+      <w:r>
+        <w:t xml:space="preserve">“</w:t>
+      </w:r>
+      <w:r>
+        <w:t xml:space="preserve">last modified</w:t>
+      </w:r>
+      <w:r>
+        <w:t xml:space="preserve">”</w:t>
+      </w:r>
+      <w:r>
+        <w:t xml:space="preserve"> </w:t>
+      </w:r>
+      <w:r>
+        <w:t xml:space="preserve">timestamp.</w:t>
+      </w:r>
+      <w:r>
+        <w:t xml:space="preserve"> </w:t>
+      </w:r>
+      <w:r>
+        <w:t xml:space="preserve">-</w:t>
+      </w:r>
+      <w:r>
+        <w:t xml:space="preserve"> </w:t>
+      </w:r>
+      <w:r>
+        <w:rPr>
+          <w:bCs/>
+          <w:b/>
+        </w:rPr>
+        <w:t xml:space="preserve">Code editor</w:t>
+      </w:r>
+      <w:r>
+        <w:t xml:space="preserve">: Full-width textarea with line numbers, monospace font, dark theme (bg-zinc-950). Supports multi-line editing with proper line height (1.5rem).</w:t>
+      </w:r>
+      <w:r>
+        <w:t xml:space="preserve"> </w:t>
+      </w:r>
+      <w:r>
+        <w:t xml:space="preserve">-</w:t>
+      </w:r>
+      <w:r>
+        <w:t xml:space="preserve"> </w:t>
+      </w:r>
+      <w:r>
+        <w:rPr>
+          <w:bCs/>
+          <w:b/>
+        </w:rPr>
+        <w:t xml:space="preserve">Unsaved changes tracking</w:t>
+      </w:r>
+      <w:r>
+        <w:t xml:space="preserve">: Compares current content with original content; shows amber</w:t>
+      </w:r>
+      <w:r>
+        <w:t xml:space="preserve"> </w:t>
+      </w:r>
+      <w:r>
+        <w:t xml:space="preserve">“</w:t>
+      </w:r>
+      <w:r>
+        <w:t xml:space="preserve">unsaved</w:t>
+      </w:r>
+      <w:r>
+        <w:t xml:space="preserve">”</w:t>
+      </w:r>
+      <w:r>
+        <w:t xml:space="preserve"> </w:t>
+      </w:r>
+      <w:r>
+        <w:t xml:space="preserve">badge when dirty.</w:t>
+      </w:r>
+      <w:r>
+        <w:t xml:space="preserve"> </w:t>
+      </w:r>
+      <w:r>
+        <w:t xml:space="preserve">“</w:t>
+      </w:r>
+      <w:r>
+        <w:t xml:space="preserve">Reload from disk</w:t>
+      </w:r>
+      <w:r>
+        <w:t xml:space="preserve">”</w:t>
+      </w:r>
+      <w:r>
+        <w:t xml:space="preserve"> </w:t>
+      </w:r>
+      <w:r>
+        <w:t xml:space="preserve">button resets to original content.</w:t>
+      </w:r>
+      <w:r>
+        <w:t xml:space="preserve"> </w:t>
+      </w:r>
+      <w:r>
+        <w:t xml:space="preserve">-</w:t>
+      </w:r>
+      <w:r>
+        <w:t xml:space="preserve"> </w:t>
+      </w:r>
+      <w:r>
+        <w:rPr>
+          <w:bCs/>
+          <w:b/>
+        </w:rPr>
+        <w:t xml:space="preserve">File operations</w:t>
+      </w:r>
+      <w:r>
+        <w:t xml:space="preserve">:</w:t>
+      </w:r>
+      <w:r>
+        <w:t xml:space="preserve"> </w:t>
+      </w:r>
+      <w:r>
+        <w:t xml:space="preserve">-</w:t>
+      </w:r>
+      <w:r>
+        <w:t xml:space="preserve"> </w:t>
+      </w:r>
+      <w:r>
+        <w:rPr>
+          <w:bCs/>
+          <w:b/>
+        </w:rPr>
+        <w:t xml:space="preserve">Save &amp; apply</w:t>
+      </w:r>
+      <w:r>
+        <w:t xml:space="preserve">: Saves file to server filesystem (TODO: backend integration)</w:t>
+      </w:r>
+      <w:r>
+        <w:t xml:space="preserve"> </w:t>
+      </w:r>
+      <w:r>
+        <w:t xml:space="preserve">-</w:t>
+      </w:r>
+      <w:r>
+        <w:t xml:space="preserve"> </w:t>
+      </w:r>
+      <w:r>
+        <w:rPr>
+          <w:bCs/>
+          <w:b/>
+        </w:rPr>
+        <w:t xml:space="preserve">Reload from disk</w:t>
+      </w:r>
+      <w:r>
+        <w:t xml:space="preserve">: Discards changes and reloads original content</w:t>
+      </w:r>
+      <w:r>
+        <w:t xml:space="preserve"> </w:t>
+      </w:r>
+      <w:r>
+        <w:t xml:space="preserve">-</w:t>
+      </w:r>
+      <w:r>
+        <w:t xml:space="preserve"> </w:t>
+      </w:r>
+      <w:r>
+        <w:rPr>
+          <w:bCs/>
+          <w:b/>
+        </w:rPr>
+        <w:t xml:space="preserve">exec via rcon</w:t>
+      </w:r>
+      <w:r>
+        <w:t xml:space="preserve">: Executes the file via RCON</w:t>
+      </w:r>
+      <w:r>
+        <w:t xml:space="preserve"> </w:t>
+      </w:r>
+      <w:r>
+        <w:rPr>
+          <w:rStyle w:val="VerbatimChar"/>
+        </w:rPr>
+        <w:t xml:space="preserve">exec &lt;filename&gt;</w:t>
+      </w:r>
+      <w:r>
+        <w:t xml:space="preserve"> </w:t>
+      </w:r>
+      <w:r>
+        <w:t xml:space="preserve">command</w:t>
+      </w:r>
+      <w:r>
+        <w:t xml:space="preserve"> </w:t>
+      </w:r>
+      <w:r>
+        <w:t xml:space="preserve">-</w:t>
+      </w:r>
+      <w:r>
+        <w:t xml:space="preserve"> </w:t>
+      </w:r>
+      <w:r>
+        <w:rPr>
+          <w:bCs/>
+          <w:b/>
+        </w:rPr>
+        <w:t xml:space="preserve">Header breadcrumb</w:t>
+      </w:r>
+      <w:r>
+        <w:t xml:space="preserve">: Shows full path</w:t>
+      </w:r>
+      <w:r>
+        <w:t xml:space="preserve"> </w:t>
+      </w:r>
+      <w:r>
+        <w:rPr>
+          <w:rStyle w:val="VerbatimChar"/>
+        </w:rPr>
+        <w:t xml:space="preserve">/home/cs2/server/csgo{selectedPath}</w:t>
+      </w:r>
+      <w:r>
+        <w:t xml:space="preserve"> </w:t>
+      </w:r>
+      <w:r>
+        <w:t xml:space="preserve">-</w:t>
+      </w:r>
+      <w:r>
+        <w:t xml:space="preserve"> </w:t>
+      </w:r>
+      <w:r>
+        <w:rPr>
+          <w:bCs/>
+          <w:b/>
+        </w:rPr>
+        <w:t xml:space="preserve">Footer status</w:t>
+      </w:r>
+      <w:r>
+        <w:t xml:space="preserve">: Displays encoding (utf-8), line endings (LF), line count, and last edit metadata</w:t>
+      </w:r>
+      <w:r>
+        <w:t xml:space="preserve"> </w:t>
+      </w:r>
+      <w:r>
+        <w:t xml:space="preserve">-</w:t>
+      </w:r>
+      <w:r>
+        <w:t xml:space="preserve"> </w:t>
+      </w:r>
+      <w:r>
+        <w:rPr>
+          <w:bCs/>
+          <w:b/>
+        </w:rPr>
+        <w:t xml:space="preserve">File selection</w:t>
+      </w:r>
+      <w:r>
+        <w:t xml:space="preserve">: Click any file in tree to load its content (currently shows demo content for all files)</w:t>
+      </w:r>
+      <w:r>
+        <w:t xml:space="preserve"> </w:t>
+      </w:r>
+      <w:r>
+        <w:t xml:space="preserve">-</w:t>
+      </w:r>
+      <w:r>
+        <w:t xml:space="preserve"> </w:t>
+      </w:r>
+      <w:r>
+        <w:rPr>
+          <w:bCs/>
+          <w:b/>
+        </w:rPr>
+        <w:t xml:space="preserve">TODO</w:t>
+      </w:r>
+      <w:r>
+        <w:t xml:space="preserve">: Real file loading from server, syntax highlighting for .cfg/.json, create new file functionality, backend integration for saving files to server filesystem</w:t>
       </w:r>
     </w:p>
     <w:p>
@@ -9698,9 +10099,9 @@
         </w:pict>
       </w:r>
     </w:p>
-    <w:bookmarkEnd w:id="62"/>
     <w:bookmarkEnd w:id="63"/>
-    <w:bookmarkStart w:id="68" w:name="plugins"/>
+    <w:bookmarkEnd w:id="64"/>
+    <w:bookmarkStart w:id="69" w:name="plugins"/>
     <w:p>
       <w:pPr>
         <w:pStyle w:val="Heading3"/>
@@ -9784,7 +10185,7 @@
         <w:t xml:space="preserve">.</w:t>
       </w:r>
     </w:p>
-    <w:bookmarkStart w:id="64" w:name="tabs-count-badges"/>
+    <w:bookmarkStart w:id="65" w:name="tabs-count-badges"/>
     <w:p>
       <w:pPr>
         <w:pStyle w:val="Heading4"/>
@@ -9840,8 +10241,8 @@
         <w:t xml:space="preserve">(Error log badge is red).</w:t>
       </w:r>
     </w:p>
-    <w:bookmarkEnd w:id="64"/>
-    <w:bookmarkStart w:id="65" w:name="installed-tab"/>
+    <w:bookmarkEnd w:id="65"/>
+    <w:bookmarkStart w:id="66" w:name="installed-tab"/>
     <w:p>
       <w:pPr>
         <w:pStyle w:val="Heading4"/>
@@ -10308,8 +10709,8 @@
         <w:t xml:space="preserve">.</w:t>
       </w:r>
     </w:p>
-    <w:bookmarkEnd w:id="65"/>
-    <w:bookmarkStart w:id="66" w:name="browse-tab-plugin-registry-marketplace"/>
+    <w:bookmarkEnd w:id="66"/>
+    <w:bookmarkStart w:id="67" w:name="browse-tab-plugin-registry-marketplace"/>
     <w:p>
       <w:pPr>
         <w:pStyle w:val="Heading4"/>
@@ -10791,8 +11192,8 @@
         <w:t xml:space="preserve">”</w:t>
       </w:r>
     </w:p>
-    <w:bookmarkEnd w:id="66"/>
-    <w:bookmarkStart w:id="67" w:name="error-log-tab"/>
+    <w:bookmarkEnd w:id="67"/>
+    <w:bookmarkStart w:id="68" w:name="error-log-tab"/>
     <w:p>
       <w:pPr>
         <w:pStyle w:val="Heading4"/>
@@ -11074,9 +11475,9 @@
         </w:pict>
       </w:r>
     </w:p>
-    <w:bookmarkEnd w:id="67"/>
     <w:bookmarkEnd w:id="68"/>
-    <w:bookmarkStart w:id="73" w:name="scheduler"/>
+    <w:bookmarkEnd w:id="69"/>
+    <w:bookmarkStart w:id="74" w:name="scheduler"/>
     <w:p>
       <w:pPr>
         <w:pStyle w:val="Heading3"/>
@@ -11148,7 +11549,7 @@
         <w:t xml:space="preserve">.</w:t>
       </w:r>
     </w:p>
-    <w:bookmarkStart w:id="69" w:name="jobs-table-left-main"/>
+    <w:bookmarkStart w:id="70" w:name="jobs-table-left-main"/>
     <w:p>
       <w:pPr>
         <w:pStyle w:val="Heading4"/>
@@ -11433,8 +11834,8 @@
         <w:t xml:space="preserve">| 2026-05-16 19:00 | 2026-05-23 19:00 (disabled) |</w:t>
       </w:r>
     </w:p>
-    <w:bookmarkEnd w:id="69"/>
-    <w:bookmarkStart w:id="70" w:name="recent-runs-table-below-jobs"/>
+    <w:bookmarkEnd w:id="70"/>
+    <w:bookmarkStart w:id="71" w:name="recent-runs-table-below-jobs"/>
     <w:p>
       <w:pPr>
         <w:pStyle w:val="Heading4"/>
@@ -11547,8 +11948,8 @@
         <w:t xml:space="preserve">| 19:00 (Fri) | Pug auto-shuffle | — | disabled (grey) |</w:t>
       </w:r>
     </w:p>
-    <w:bookmarkEnd w:id="70"/>
-    <w:bookmarkStart w:id="71" w:name="presets-panel-right"/>
+    <w:bookmarkEnd w:id="71"/>
+    <w:bookmarkStart w:id="72" w:name="presets-panel-right"/>
     <w:p>
       <w:pPr>
         <w:pStyle w:val="Heading4"/>
@@ -11653,8 +12054,8 @@
         <w:t xml:space="preserve">on-event down → webhook discord_alerts</w:t>
       </w:r>
     </w:p>
-    <w:bookmarkEnd w:id="71"/>
-    <w:bookmarkStart w:id="72" w:name="next-24h-panel-right-below-presets"/>
+    <w:bookmarkEnd w:id="72"/>
+    <w:bookmarkStart w:id="73" w:name="next-24h-panel-right-below-presets"/>
     <w:p>
       <w:pPr>
         <w:pStyle w:val="Heading4"/>
@@ -11775,9 +12176,9 @@
         </w:pict>
       </w:r>
     </w:p>
-    <w:bookmarkEnd w:id="72"/>
     <w:bookmarkEnd w:id="73"/>
-    <w:bookmarkStart w:id="79" w:name="admin"/>
+    <w:bookmarkEnd w:id="74"/>
+    <w:bookmarkStart w:id="80" w:name="admin"/>
     <w:p>
       <w:pPr>
         <w:pStyle w:val="Heading3"/>
@@ -11849,7 +12250,7 @@
         <w:t xml:space="preserve">.</w:t>
       </w:r>
     </w:p>
-    <w:bookmarkStart w:id="74" w:name="tabs"/>
+    <w:bookmarkStart w:id="75" w:name="tabs"/>
     <w:p>
       <w:pPr>
         <w:pStyle w:val="Heading4"/>
@@ -11917,8 +12318,8 @@
         <w:t xml:space="preserve">.</w:t>
       </w:r>
     </w:p>
-    <w:bookmarkEnd w:id="74"/>
-    <w:bookmarkStart w:id="75" w:name="users-roles-tab"/>
+    <w:bookmarkEnd w:id="75"/>
+    <w:bookmarkStart w:id="76" w:name="users-roles-tab"/>
     <w:p>
       <w:pPr>
         <w:pStyle w:val="Heading4"/>
@@ -12107,8 +12508,8 @@
         <w:t xml:space="preserve">| manage servers | ✓ | · | · |</w:t>
       </w:r>
     </w:p>
-    <w:bookmarkEnd w:id="75"/>
-    <w:bookmarkStart w:id="76" w:name="audit-log-tab"/>
+    <w:bookmarkEnd w:id="76"/>
+    <w:bookmarkStart w:id="77" w:name="audit-log-tab"/>
     <w:p>
       <w:pPr>
         <w:pStyle w:val="Heading4"/>
@@ -12353,8 +12754,8 @@
         <w:t xml:space="preserve">| 12:02:11 | m0use@ | signin | from 84.124.221.9 — chrome/macOS | ✓ |</w:t>
       </w:r>
     </w:p>
-    <w:bookmarkEnd w:id="76"/>
-    <w:bookmarkStart w:id="77" w:name="integrations-tab-4-cards"/>
+    <w:bookmarkEnd w:id="77"/>
+    <w:bookmarkStart w:id="78" w:name="integrations-tab-4-cards"/>
     <w:p>
       <w:pPr>
         <w:pStyle w:val="Heading4"/>
@@ -12804,8 +13205,8 @@
         <w:t xml:space="preserve">03:00 · 412 MB · ok</w:t>
       </w:r>
     </w:p>
-    <w:bookmarkEnd w:id="77"/>
-    <w:bookmarkStart w:id="78" w:name="gotv-demos-tab"/>
+    <w:bookmarkEnd w:id="78"/>
+    <w:bookmarkStart w:id="79" w:name="gotv-demos-tab"/>
     <w:p>
       <w:pPr>
         <w:pStyle w:val="Heading4"/>
@@ -13059,9 +13460,9 @@
         </w:pict>
       </w:r>
     </w:p>
-    <w:bookmarkEnd w:id="78"/>
     <w:bookmarkEnd w:id="79"/>
-    <w:bookmarkStart w:id="80" w:name="multi-server-switcher"/>
+    <w:bookmarkEnd w:id="80"/>
+    <w:bookmarkStart w:id="81" w:name="multi-server-switcher"/>
     <w:p>
       <w:pPr>
         <w:pStyle w:val="Heading3"/>
@@ -13292,8 +13693,8 @@
         </w:pict>
       </w:r>
     </w:p>
-    <w:bookmarkEnd w:id="80"/>
-    <w:bookmarkStart w:id="81" w:name="login-auth-session"/>
+    <w:bookmarkEnd w:id="81"/>
+    <w:bookmarkStart w:id="82" w:name="login-auth-session"/>
     <w:p>
       <w:pPr>
         <w:pStyle w:val="Heading3"/>
@@ -13636,8 +14037,8 @@
         </w:pict>
       </w:r>
     </w:p>
-    <w:bookmarkEnd w:id="81"/>
-    <w:bookmarkStart w:id="82" w:name="global-search-command-palette"/>
+    <w:bookmarkEnd w:id="82"/>
+    <w:bookmarkStart w:id="83" w:name="global-search-command-palette"/>
     <w:p>
       <w:pPr>
         <w:pStyle w:val="Heading3"/>
@@ -13753,9 +14154,9 @@
         </w:pict>
       </w:r>
     </w:p>
-    <w:bookmarkEnd w:id="82"/>
     <w:bookmarkEnd w:id="83"/>
-    <w:bookmarkStart w:id="84" w:name="Xb3dc79d59a5ce2f8117aa7a57871f6dd7183cb9"/>
+    <w:bookmarkEnd w:id="84"/>
+    <w:bookmarkStart w:id="85" w:name="Xb3dc79d59a5ce2f8117aa7a57871f6dd7183cb9"/>
     <w:p>
       <w:pPr>
         <w:pStyle w:val="Heading2"/>
@@ -14245,8 +14646,8 @@
         <w:t xml:space="preserve">This document was compiled from observations of the nokit demo. Keep it updated as features move from ❌ (demo/planned) to ✅ (implemented).</w:t>
       </w:r>
     </w:p>
-    <w:bookmarkEnd w:id="84"/>
     <w:bookmarkEnd w:id="85"/>
+    <w:bookmarkEnd w:id="86"/>
     <w:sectPr/>
   </w:body>
 </w:document>

</xml_diff>

<commit_message>
feat: Maps panel with favorites, workshop support, and map cycle editor (#10)
- Add MapsPage component with full layout (favorites, standard pool, workshop, map cycle)
- Standard map pool: 12 CS2 maps (comp, hostage, practice modes) from cs2-maps.json
- Favorites system: localStorage persistence, star/unstar, show favs only toggle
- Active map tracking: green highlight, RCON changelevel integration
- Workshop maps: display demo workshop maps, input field for workshop ID
- Map cycle editor: reorderable list, remove maps, localStorage persistence
- RCON integration: changelevel and host_workshop_map commands
- Responsive 4-column grid layout with hover states
- Update routing in App.tsx to render MapsPage
- Update documentation (README.md, featureDetail.md)

TODO: real map thumbnails, drag-and-drop reordering, Steam Workshop API

Co-authored-by: wiblash-s <wiblash-s@users.noreply.github.com>
</commit_message>
<xml_diff>
--- a/featureDetail.docx
+++ b/featureDetail.docx
@@ -585,7 +585,7 @@
               <w:jc w:val="left"/>
             </w:pPr>
             <w:r>
-              <w:t xml:space="preserve">❌ Not built</w:t>
+              <w:t xml:space="preserve">✅ Implemented</w:t>
             </w:r>
           </w:p>
         </w:tc>
@@ -597,7 +597,7 @@
               <w:jc w:val="left"/>
             </w:pPr>
             <w:r>
-              <w:t xml:space="preserve">Demo only / planned</w:t>
+              <w:t xml:space="preserve">Standard map pool (12 maps), favorites system (localStorage), workshop map support, map cycle editor, RCON integration (changelevel, host_workshop_map)</w:t>
             </w:r>
           </w:p>
         </w:tc>
@@ -7676,6 +7676,379 @@
       </w:r>
       <w:r>
         <w:t xml:space="preserve">button (writes the cycle to mapcycle.txt).</w:t>
+      </w:r>
+    </w:p>
+    <w:p>
+      <w:pPr>
+        <w:pStyle w:val="BlockText"/>
+      </w:pPr>
+      <w:r>
+        <w:rPr>
+          <w:bCs/>
+          <w:b/>
+        </w:rPr>
+        <w:t xml:space="preserve">✅ Current implementation status (this fork):</w:t>
+      </w:r>
+      <w:r>
+        <w:t xml:space="preserve"> </w:t>
+      </w:r>
+      <w:r>
+        <w:t xml:space="preserve">The Maps panel is fully built as a functional page. The component lives in</w:t>
+      </w:r>
+      <w:r>
+        <w:t xml:space="preserve"> </w:t>
+      </w:r>
+      <w:r>
+        <w:rPr>
+          <w:rStyle w:val="VerbatimChar"/>
+        </w:rPr>
+        <w:t xml:space="preserve">web/src/pages/maps-page.tsx</w:t>
+      </w:r>
+      <w:r>
+        <w:t xml:space="preserve"> </w:t>
+      </w:r>
+      <w:r>
+        <w:t xml:space="preserve">(exported as</w:t>
+      </w:r>
+      <w:r>
+        <w:t xml:space="preserve"> </w:t>
+      </w:r>
+      <w:r>
+        <w:rPr>
+          <w:rStyle w:val="VerbatimChar"/>
+        </w:rPr>
+        <w:t xml:space="preserve">MapsPage</w:t>
+      </w:r>
+      <w:r>
+        <w:t xml:space="preserve">) and is rendered from the</w:t>
+      </w:r>
+      <w:r>
+        <w:t xml:space="preserve"> </w:t>
+      </w:r>
+      <w:r>
+        <w:rPr>
+          <w:rStyle w:val="VerbatimChar"/>
+        </w:rPr>
+        <w:t xml:space="preserve">/servers/:id/maps</w:t>
+      </w:r>
+      <w:r>
+        <w:t xml:space="preserve"> </w:t>
+      </w:r>
+      <w:r>
+        <w:t xml:space="preserve">route in</w:t>
+      </w:r>
+      <w:r>
+        <w:t xml:space="preserve"> </w:t>
+      </w:r>
+      <w:r>
+        <w:rPr>
+          <w:rStyle w:val="VerbatimChar"/>
+        </w:rPr>
+        <w:t xml:space="preserve">App.tsx</w:t>
+      </w:r>
+      <w:r>
+        <w:t xml:space="preserve">. It uses the existing</w:t>
+      </w:r>
+      <w:r>
+        <w:t xml:space="preserve"> </w:t>
+      </w:r>
+      <w:r>
+        <w:rPr>
+          <w:rStyle w:val="VerbatimChar"/>
+        </w:rPr>
+        <w:t xml:space="preserve">POST /api/servers/:id/rcon</w:t>
+      </w:r>
+      <w:r>
+        <w:t xml:space="preserve"> </w:t>
+      </w:r>
+      <w:r>
+        <w:t xml:space="preserve">endpoint for map changes — no new backend routes were added.</w:t>
+      </w:r>
+      <w:r>
+        <w:t xml:space="preserve"> </w:t>
+      </w:r>
+      <w:r>
+        <w:t xml:space="preserve">-</w:t>
+      </w:r>
+      <w:r>
+        <w:t xml:space="preserve"> </w:t>
+      </w:r>
+      <w:r>
+        <w:rPr>
+          <w:bCs/>
+          <w:b/>
+        </w:rPr>
+        <w:t xml:space="preserve">Standard map pool</w:t>
+      </w:r>
+      <w:r>
+        <w:t xml:space="preserve">: 12 CS2 maps loaded from</w:t>
+      </w:r>
+      <w:r>
+        <w:t xml:space="preserve"> </w:t>
+      </w:r>
+      <w:r>
+        <w:rPr>
+          <w:rStyle w:val="VerbatimChar"/>
+        </w:rPr>
+        <w:t xml:space="preserve">web/src/data/cs2-maps.json</w:t>
+      </w:r>
+      <w:r>
+        <w:t xml:space="preserve"> </w:t>
+      </w:r>
+      <w:r>
+        <w:t xml:space="preserve">(Mirage, Inferno, Dust II, Nuke, Overpass, Anubis, Vertigo, Ancient, Train, Office, Italy, aim_botz) with categorization by mode (comp, hostage, practice).</w:t>
+      </w:r>
+      <w:r>
+        <w:t xml:space="preserve"> </w:t>
+      </w:r>
+      <w:r>
+        <w:t xml:space="preserve">-</w:t>
+      </w:r>
+      <w:r>
+        <w:t xml:space="preserve"> </w:t>
+      </w:r>
+      <w:r>
+        <w:rPr>
+          <w:bCs/>
+          <w:b/>
+        </w:rPr>
+        <w:t xml:space="preserve">Favorites system</w:t>
+      </w:r>
+      <w:r>
+        <w:t xml:space="preserve">: Users can star/unstar maps; favorites are persisted in</w:t>
+      </w:r>
+      <w:r>
+        <w:t xml:space="preserve"> </w:t>
+      </w:r>
+      <w:r>
+        <w:rPr>
+          <w:rStyle w:val="VerbatimChar"/>
+        </w:rPr>
+        <w:t xml:space="preserve">localStorage</w:t>
+      </w:r>
+      <w:r>
+        <w:t xml:space="preserve"> </w:t>
+      </w:r>
+      <w:r>
+        <w:t xml:space="preserve">under</w:t>
+      </w:r>
+      <w:r>
+        <w:t xml:space="preserve"> </w:t>
+      </w:r>
+      <w:r>
+        <w:rPr>
+          <w:rStyle w:val="VerbatimChar"/>
+        </w:rPr>
+        <w:t xml:space="preserve">nokit_map_favorites</w:t>
+      </w:r>
+      <w:r>
+        <w:t xml:space="preserve">. A</w:t>
+      </w:r>
+      <w:r>
+        <w:t xml:space="preserve"> </w:t>
+      </w:r>
+      <w:r>
+        <w:t xml:space="preserve">“</w:t>
+      </w:r>
+      <w:r>
+        <w:t xml:space="preserve">show favs only</w:t>
+      </w:r>
+      <w:r>
+        <w:t xml:space="preserve">”</w:t>
+      </w:r>
+      <w:r>
+        <w:t xml:space="preserve"> </w:t>
+      </w:r>
+      <w:r>
+        <w:t xml:space="preserve">toggle filters the grid to show only favorited maps. Favorite maps are displayed in a compact horizontal row at the top for quick access.</w:t>
+      </w:r>
+      <w:r>
+        <w:t xml:space="preserve"> </w:t>
+      </w:r>
+      <w:r>
+        <w:t xml:space="preserve">-</w:t>
+      </w:r>
+      <w:r>
+        <w:t xml:space="preserve"> </w:t>
+      </w:r>
+      <w:r>
+        <w:rPr>
+          <w:bCs/>
+          <w:b/>
+        </w:rPr>
+        <w:t xml:space="preserve">Active map tracking</w:t>
+      </w:r>
+      <w:r>
+        <w:t xml:space="preserve">: The currently active map is highlighted with a green border and</w:t>
+      </w:r>
+      <w:r>
+        <w:t xml:space="preserve"> </w:t>
+      </w:r>
+      <w:r>
+        <w:t xml:space="preserve">“</w:t>
+      </w:r>
+      <w:r>
+        <w:t xml:space="preserve">● active</w:t>
+      </w:r>
+      <w:r>
+        <w:t xml:space="preserve">”</w:t>
+      </w:r>
+      <w:r>
+        <w:t xml:space="preserve"> </w:t>
+      </w:r>
+      <w:r>
+        <w:t xml:space="preserve">badge. Map changes are triggered via RCON</w:t>
+      </w:r>
+      <w:r>
+        <w:t xml:space="preserve"> </w:t>
+      </w:r>
+      <w:r>
+        <w:rPr>
+          <w:rStyle w:val="VerbatimChar"/>
+        </w:rPr>
+        <w:t xml:space="preserve">changelevel &lt;mapid&gt;</w:t>
+      </w:r>
+      <w:r>
+        <w:t xml:space="preserve"> </w:t>
+      </w:r>
+      <w:r>
+        <w:t xml:space="preserve">command.</w:t>
+      </w:r>
+      <w:r>
+        <w:t xml:space="preserve"> </w:t>
+      </w:r>
+      <w:r>
+        <w:t xml:space="preserve">-</w:t>
+      </w:r>
+      <w:r>
+        <w:t xml:space="preserve"> </w:t>
+      </w:r>
+      <w:r>
+        <w:rPr>
+          <w:bCs/>
+          <w:b/>
+        </w:rPr>
+        <w:t xml:space="preserve">Workshop maps</w:t>
+      </w:r>
+      <w:r>
+        <w:t xml:space="preserve">: Demo section displays 4 workshop maps (de_cache_redux, awp_lego, surf_kitsune_ksf, de_season) with author, subscriber count, and workshop ID. Users can input a workshop ID and load it via RCON</w:t>
+      </w:r>
+      <w:r>
+        <w:t xml:space="preserve"> </w:t>
+      </w:r>
+      <w:r>
+        <w:rPr>
+          <w:rStyle w:val="VerbatimChar"/>
+        </w:rPr>
+        <w:t xml:space="preserve">host_workshop_map &lt;workshopid&gt;</w:t>
+      </w:r>
+      <w:r>
+        <w:t xml:space="preserve"> </w:t>
+      </w:r>
+      <w:r>
+        <w:t xml:space="preserve">command.</w:t>
+      </w:r>
+      <w:r>
+        <w:t xml:space="preserve"> </w:t>
+      </w:r>
+      <w:r>
+        <w:t xml:space="preserve">-</w:t>
+      </w:r>
+      <w:r>
+        <w:t xml:space="preserve"> </w:t>
+      </w:r>
+      <w:r>
+        <w:rPr>
+          <w:bCs/>
+          <w:b/>
+        </w:rPr>
+        <w:t xml:space="preserve">Map cycle editor</w:t>
+      </w:r>
+      <w:r>
+        <w:t xml:space="preserve">: Displays an ordered list of maps in the rotation (persisted in</w:t>
+      </w:r>
+      <w:r>
+        <w:t xml:space="preserve"> </w:t>
+      </w:r>
+      <w:r>
+        <w:rPr>
+          <w:rStyle w:val="VerbatimChar"/>
+        </w:rPr>
+        <w:t xml:space="preserve">localStorage</w:t>
+      </w:r>
+      <w:r>
+        <w:t xml:space="preserve"> </w:t>
+      </w:r>
+      <w:r>
+        <w:t xml:space="preserve">under</w:t>
+      </w:r>
+      <w:r>
+        <w:t xml:space="preserve"> </w:t>
+      </w:r>
+      <w:r>
+        <w:rPr>
+          <w:rStyle w:val="VerbatimChar"/>
+        </w:rPr>
+        <w:t xml:space="preserve">nokit_map_cycle</w:t>
+      </w:r>
+      <w:r>
+        <w:t xml:space="preserve">). Users can remove maps from the cycle; the default cycle includes 7 competitive maps.</w:t>
+      </w:r>
+      <w:r>
+        <w:t xml:space="preserve"> </w:t>
+      </w:r>
+      <w:r>
+        <w:t xml:space="preserve">“</w:t>
+      </w:r>
+      <w:r>
+        <w:t xml:space="preserve">Save mapcycle.txt</w:t>
+      </w:r>
+      <w:r>
+        <w:t xml:space="preserve">”</w:t>
+      </w:r>
+      <w:r>
+        <w:t xml:space="preserve"> </w:t>
+      </w:r>
+      <w:r>
+        <w:t xml:space="preserve">button is ready for backend integration to write the cycle to the server’s mapcycle.txt file.</w:t>
+      </w:r>
+      <w:r>
+        <w:t xml:space="preserve"> </w:t>
+      </w:r>
+      <w:r>
+        <w:t xml:space="preserve">-</w:t>
+      </w:r>
+      <w:r>
+        <w:t xml:space="preserve"> </w:t>
+      </w:r>
+      <w:r>
+        <w:rPr>
+          <w:bCs/>
+          <w:b/>
+        </w:rPr>
+        <w:t xml:space="preserve">Responsive grid</w:t>
+      </w:r>
+      <w:r>
+        <w:t xml:space="preserve">: Map cards display in a 4-column grid (responsive: 1 col mobile, 2 col tablet, 3 col desktop, 4 col wide) with hover states and click-to-change functionality.</w:t>
+      </w:r>
+      <w:r>
+        <w:t xml:space="preserve"> </w:t>
+      </w:r>
+      <w:r>
+        <w:t xml:space="preserve">-</w:t>
+      </w:r>
+      <w:r>
+        <w:t xml:space="preserve"> </w:t>
+      </w:r>
+      <w:r>
+        <w:rPr>
+          <w:bCs/>
+          <w:b/>
+        </w:rPr>
+        <w:t xml:space="preserve">TODO</w:t>
+      </w:r>
+      <w:r>
+        <w:t xml:space="preserve">: Map thumbnail images (currently showing placeholder gradients), drag-and-drop reordering for map cycle, Steam Workshop API integration for fetching workshop map metadata and thumbnails.</w:t>
       </w:r>
     </w:p>
     <w:p>

</xml_diff>

<commit_message>
feat: Config Editor with file browser and code editing (#11)
- Add ConfigEditorPage component with two-panel layout
- File browser tree: hierarchical tree view with expand/collapse folders
- Mock data: 7 files + 3 folders (gamemodes, matchzy, cs_sharp)
- Code editor: full-width textarea with line numbers, dark theme
- Unsaved changes tracking: amber badge when content modified
- File operations: save/reload/exec via RCON
- Header: breadcrumb path display
- Footer: encoding, line endings, line count, last edit metadata
- Update routing in App.tsx to render ConfigEditorPage
- Update documentation (README.md, featureDetail.md)

TODO: real file loading, syntax highlighting, backend integration for file save

Co-authored-by: wiblash-s <wiblash-s@users.noreply.github.com>
</commit_message>
<xml_diff>
--- a/featureDetail.docx
+++ b/featureDetail.docx
@@ -2,7 +2,7 @@
 <file path=word/document.xml><?xml version="1.0" encoding="utf-8"?>
 <w:document xmlns:w="http://schemas.openxmlformats.org/wordprocessingml/2006/main" xmlns:m="http://schemas.openxmlformats.org/officeDocument/2006/math" xmlns:r="http://schemas.openxmlformats.org/officeDocument/2006/relationships" xmlns:o="urn:schemas-microsoft-com:office:office" xmlns:v="urn:schemas-microsoft-com:vml" xmlns:w10="urn:schemas-microsoft-com:office:word" xmlns:a="http://schemas.openxmlformats.org/drawingml/2006/main" xmlns:pic="http://schemas.openxmlformats.org/drawingml/2006/picture" xmlns:wp="http://schemas.openxmlformats.org/drawingml/2006/wordprocessingDrawing">
   <w:body>
-    <w:bookmarkStart w:id="85" w:name="feature-detail-demo-reference"/>
+    <w:bookmarkStart w:id="86" w:name="feature-detail-demo-reference"/>
     <w:p>
       <w:pPr>
         <w:pStyle w:val="Heading1"/>
@@ -421,7 +421,7 @@
               <w:jc w:val="left"/>
             </w:pPr>
             <w:r>
-              <w:t xml:space="preserve">Full terminal UI: timestamps, color-coded output, ↑↓ history, Ctrl+L clear, Tab autocomplete (CS2 CVARs), RCON macros sidebar with localStorage persistence, clickable history panel, live/paused scroll toggle, Copy session &amp; Export</w:t>
+              <w:t xml:space="preserve">Full terminal UI: timestamps, color-coded output, ↑↓ history, Ctrl+L clear, Tab autocomplete (5000+ CS2 CVARs/commands), RCON macros sidebar with localStorage persistence, clickable history panel, live/paused scroll toggle, Copy session &amp; Export</w:t>
             </w:r>
           </w:p>
         </w:tc>
@@ -661,7 +661,7 @@
               <w:jc w:val="left"/>
             </w:pPr>
             <w:r>
-              <w:t xml:space="preserve">❌ Not built</w:t>
+              <w:t xml:space="preserve">✅ Implemented</w:t>
             </w:r>
           </w:p>
         </w:tc>
@@ -673,7 +673,7 @@
               <w:jc w:val="left"/>
             </w:pPr>
             <w:r>
-              <w:t xml:space="preserve">Demo only / planned</w:t>
+              <w:t xml:space="preserve">File browser tree view, code editor with line numbers, unsaved changes tracking, save/reload/exec via RCON, support for .cfg and .json files</w:t>
             </w:r>
           </w:p>
         </w:tc>
@@ -801,7 +801,7 @@
       </w:r>
     </w:p>
     <w:bookmarkEnd w:id="22"/>
-    <w:bookmarkStart w:id="83" w:name="Xdae9c888683b0c901a881bea1d864a479c2ddb5"/>
+    <w:bookmarkStart w:id="84" w:name="Xdae9c888683b0c901a881bea1d864a479c2ddb5"/>
     <w:p>
       <w:pPr>
         <w:pStyle w:val="Heading2"/>
@@ -3406,7 +3406,7 @@
     </w:p>
     <w:bookmarkEnd w:id="32"/>
     <w:bookmarkEnd w:id="33"/>
-    <w:bookmarkStart w:id="38" w:name="rcon-console"/>
+    <w:bookmarkStart w:id="39" w:name="rcon-console"/>
     <w:p>
       <w:pPr>
         <w:pStyle w:val="Heading3"/>
@@ -3959,7 +3959,7 @@
       </w:r>
     </w:p>
     <w:bookmarkEnd w:id="36"/>
-    <w:bookmarkStart w:id="37" w:name="history-panel-right-sidebar-below-macros"/>
+    <w:bookmarkStart w:id="38" w:name="history-panel-right-sidebar-below-macros"/>
     <w:p>
       <w:pPr>
         <w:pStyle w:val="Heading4"/>
@@ -4244,7 +4244,49 @@
         <w:t xml:space="preserve"> </w:t>
       </w:r>
       <w:r>
-        <w:t xml:space="preserve">with shell-style keyboard shortcuts — ↑↓ navigate command history, Ctrl+L clears the terminal, and Tab triggers autocomplete with a dropdown covering 30+ common CS2 CVARs/commands.</w:t>
+        <w:t xml:space="preserve">with shell-style keyboard shortcuts — ↑↓ navigate command history, Ctrl+L clears the terminal, and Tab triggers autocomplete with a dropdown covering</w:t>
+      </w:r>
+      <w:r>
+        <w:t xml:space="preserve"> </w:t>
+      </w:r>
+      <w:r>
+        <w:rPr>
+          <w:bCs/>
+          <w:b/>
+        </w:rPr>
+        <w:t xml:space="preserve">5000+ CS2 CVARs/commands</w:t>
+      </w:r>
+      <w:r>
+        <w:t xml:space="preserve"> </w:t>
+      </w:r>
+      <w:r>
+        <w:t xml:space="preserve">(loaded from</w:t>
+      </w:r>
+      <w:r>
+        <w:t xml:space="preserve"> </w:t>
+      </w:r>
+      <w:r>
+        <w:rPr>
+          <w:rStyle w:val="VerbatimChar"/>
+        </w:rPr>
+        <w:t xml:space="preserve">web/src/data/cs2-commands.json</w:t>
+      </w:r>
+      <w:r>
+        <w:t xml:space="preserve">, sourced from</w:t>
+      </w:r>
+      <w:r>
+        <w:t xml:space="preserve"> </w:t>
+      </w:r>
+      <w:hyperlink r:id="rId37">
+        <w:r>
+          <w:rPr>
+            <w:rStyle w:val="Hyperlink"/>
+          </w:rPr>
+          <w:t xml:space="preserve">ArminC-CS2-Cvars</w:t>
+        </w:r>
+      </w:hyperlink>
+      <w:r>
+        <w:t xml:space="preserve">). The autocomplete is capped at 50 suggestions per prefix for performance.</w:t>
       </w:r>
       <w:r>
         <w:t xml:space="preserve"> </w:t>
@@ -4450,9 +4492,9 @@
         </w:pict>
       </w:r>
     </w:p>
-    <w:bookmarkEnd w:id="37"/>
     <w:bookmarkEnd w:id="38"/>
-    <w:bookmarkStart w:id="43" w:name="live-logs"/>
+    <w:bookmarkEnd w:id="39"/>
+    <w:bookmarkStart w:id="44" w:name="live-logs"/>
     <w:p>
       <w:pPr>
         <w:pStyle w:val="Heading3"/>
@@ -4551,7 +4593,7 @@
         <w:t xml:space="preserve">button.</w:t>
       </w:r>
     </w:p>
-    <w:bookmarkStart w:id="39" w:name="filter-tabs-with-count-badges"/>
+    <w:bookmarkStart w:id="40" w:name="filter-tabs-with-count-badges"/>
     <w:p>
       <w:pPr>
         <w:pStyle w:val="Heading4"/>
@@ -4686,8 +4728,8 @@
         <w:t xml:space="preserve">count (verified — Chat tab showed only the 3 chat lines).</w:t>
       </w:r>
     </w:p>
-    <w:bookmarkEnd w:id="39"/>
-    <w:bookmarkStart w:id="40" w:name="search-grep-bar"/>
+    <w:bookmarkEnd w:id="40"/>
+    <w:bookmarkStart w:id="41" w:name="search-grep-bar"/>
     <w:p>
       <w:pPr>
         <w:pStyle w:val="Heading4"/>
@@ -4790,8 +4832,8 @@
         <w:t xml:space="preserve">throughput label.</w:t>
       </w:r>
     </w:p>
-    <w:bookmarkEnd w:id="40"/>
-    <w:bookmarkStart w:id="41" w:name="X83fd1569fedee2698301e9ebdc89729d7a65092"/>
+    <w:bookmarkEnd w:id="41"/>
+    <w:bookmarkStart w:id="42" w:name="X83fd1569fedee2698301e9ebdc89729d7a65092"/>
     <w:p>
       <w:pPr>
         <w:pStyle w:val="Heading4"/>
@@ -5219,8 +5261,8 @@
         <w:t xml:space="preserve">12:53:01  rcon   &gt; changelevel de_inferno</w:t>
       </w:r>
     </w:p>
-    <w:bookmarkEnd w:id="41"/>
-    <w:bookmarkStart w:id="42" w:name="stream-footer"/>
+    <w:bookmarkEnd w:id="42"/>
+    <w:bookmarkStart w:id="43" w:name="stream-footer"/>
     <w:p>
       <w:pPr>
         <w:pStyle w:val="Heading4"/>
@@ -5318,9 +5360,9 @@
         </w:pict>
       </w:r>
     </w:p>
-    <w:bookmarkEnd w:id="42"/>
     <w:bookmarkEnd w:id="43"/>
-    <w:bookmarkStart w:id="50" w:name="players"/>
+    <w:bookmarkEnd w:id="44"/>
+    <w:bookmarkStart w:id="51" w:name="players"/>
     <w:p>
       <w:pPr>
         <w:pStyle w:val="Heading3"/>
@@ -5404,7 +5446,7 @@
         <w:t xml:space="preserve">.</w:t>
       </w:r>
     </w:p>
-    <w:bookmarkStart w:id="44" w:name="tabs-with-count-badges"/>
+    <w:bookmarkStart w:id="45" w:name="tabs-with-count-badges"/>
     <w:p>
       <w:pPr>
         <w:pStyle w:val="Heading4"/>
@@ -5469,8 +5511,8 @@
         <w:t xml:space="preserve">Session history</w:t>
       </w:r>
     </w:p>
-    <w:bookmarkEnd w:id="44"/>
-    <w:bookmarkStart w:id="45" w:name="common-controls"/>
+    <w:bookmarkEnd w:id="45"/>
+    <w:bookmarkStart w:id="46" w:name="common-controls"/>
     <w:p>
       <w:pPr>
         <w:pStyle w:val="Heading4"/>
@@ -5551,8 +5593,8 @@
         <w:t xml:space="preserve">button (right).</w:t>
       </w:r>
     </w:p>
-    <w:bookmarkEnd w:id="45"/>
-    <w:bookmarkStart w:id="46" w:name="live-tab-table-columns"/>
+    <w:bookmarkEnd w:id="46"/>
+    <w:bookmarkStart w:id="47" w:name="live-tab-table-columns"/>
     <w:p>
       <w:pPr>
         <w:pStyle w:val="Heading4"/>
@@ -6810,8 +6852,8 @@
         <w:t xml:space="preserve">(red/danger).</w:t>
       </w:r>
     </w:p>
-    <w:bookmarkEnd w:id="46"/>
-    <w:bookmarkStart w:id="47" w:name="watchlist-tab-table-columns"/>
+    <w:bookmarkEnd w:id="47"/>
+    <w:bookmarkStart w:id="48" w:name="watchlist-tab-table-columns"/>
     <w:p>
       <w:pPr>
         <w:pStyle w:val="Heading4"/>
@@ -6873,8 +6915,8 @@
         <w:t xml:space="preserve">- Each row has an amber flag icon. STATUS is a colored pill (green online / grey offline).</w:t>
       </w:r>
     </w:p>
-    <w:bookmarkEnd w:id="47"/>
-    <w:bookmarkStart w:id="48" w:name="bans-tab-table-columns"/>
+    <w:bookmarkEnd w:id="48"/>
+    <w:bookmarkStart w:id="49" w:name="bans-tab-table-columns"/>
     <w:p>
       <w:pPr>
         <w:pStyle w:val="Heading4"/>
@@ -6951,8 +6993,8 @@
         <w:t xml:space="preserve">pill.</w:t>
       </w:r>
     </w:p>
-    <w:bookmarkEnd w:id="48"/>
-    <w:bookmarkStart w:id="49" w:name="session-history-tab"/>
+    <w:bookmarkEnd w:id="49"/>
+    <w:bookmarkStart w:id="50" w:name="session-history-tab"/>
     <w:p>
       <w:pPr>
         <w:pStyle w:val="Heading4"/>
@@ -7015,9 +7057,9 @@
         </w:pict>
       </w:r>
     </w:p>
-    <w:bookmarkEnd w:id="49"/>
     <w:bookmarkEnd w:id="50"/>
-    <w:bookmarkStart w:id="55" w:name="maps"/>
+    <w:bookmarkEnd w:id="51"/>
+    <w:bookmarkStart w:id="56" w:name="maps"/>
     <w:p>
       <w:pPr>
         <w:pStyle w:val="Heading3"/>
@@ -7089,7 +7131,7 @@
         <w:t xml:space="preserve">.</w:t>
       </w:r>
     </w:p>
-    <w:bookmarkStart w:id="51" w:name="favorites-row"/>
+    <w:bookmarkStart w:id="52" w:name="favorites-row"/>
     <w:p>
       <w:pPr>
         <w:pStyle w:val="Heading4"/>
@@ -7184,8 +7226,8 @@
         <w:t xml:space="preserve">- aim_botz · practice</w:t>
       </w:r>
     </w:p>
-    <w:bookmarkEnd w:id="51"/>
-    <w:bookmarkStart w:id="52" w:name="standard-pool-grid-4-across-cards"/>
+    <w:bookmarkEnd w:id="52"/>
+    <w:bookmarkStart w:id="53" w:name="standard-pool-grid-4-across-cards"/>
     <w:p>
       <w:pPr>
         <w:pStyle w:val="Heading4"/>
@@ -7448,8 +7490,8 @@
         <w:t xml:space="preserve">badge and highlight move to the clicked card (both its pool card and favorites card update). This is how you change the current map.</w:t>
       </w:r>
     </w:p>
-    <w:bookmarkEnd w:id="52"/>
-    <w:bookmarkStart w:id="53" w:name="workshop-section"/>
+    <w:bookmarkEnd w:id="53"/>
+    <w:bookmarkStart w:id="54" w:name="workshop-section"/>
     <w:p>
       <w:pPr>
         <w:pStyle w:val="Heading4"/>
@@ -7582,8 +7624,8 @@
         <w:t xml:space="preserve">| de_season | by sumamon | 441k subs | #3072201991 |</w:t>
       </w:r>
     </w:p>
-    <w:bookmarkEnd w:id="53"/>
-    <w:bookmarkStart w:id="54" w:name="map-cycle-editor-bottom"/>
+    <w:bookmarkEnd w:id="54"/>
+    <w:bookmarkStart w:id="55" w:name="map-cycle-editor-bottom"/>
     <w:p>
       <w:pPr>
         <w:pStyle w:val="Heading4"/>
@@ -8058,9 +8100,9 @@
         </w:pict>
       </w:r>
     </w:p>
-    <w:bookmarkEnd w:id="54"/>
     <w:bookmarkEnd w:id="55"/>
-    <w:bookmarkStart w:id="60" w:name="cvar-presets"/>
+    <w:bookmarkEnd w:id="56"/>
+    <w:bookmarkStart w:id="61" w:name="cvar-presets"/>
     <w:p>
       <w:pPr>
         <w:pStyle w:val="Heading3"/>
@@ -8144,7 +8186,7 @@
         <w:t xml:space="preserve">.</w:t>
       </w:r>
     </w:p>
-    <w:bookmarkStart w:id="56" w:name="layout"/>
+    <w:bookmarkStart w:id="57" w:name="layout"/>
     <w:p>
       <w:pPr>
         <w:pStyle w:val="Heading4"/>
@@ -8229,8 +8271,8 @@
         <w:t xml:space="preserve">panel.</w:t>
       </w:r>
     </w:p>
-    <w:bookmarkEnd w:id="56"/>
-    <w:bookmarkStart w:id="57" w:name="preset-categories-chips"/>
+    <w:bookmarkEnd w:id="57"/>
+    <w:bookmarkStart w:id="58" w:name="preset-categories-chips"/>
     <w:p>
       <w:pPr>
         <w:pStyle w:val="Heading4"/>
@@ -8694,8 +8736,8 @@
         <w:t xml:space="preserve">+ custom…</w:t>
       </w:r>
     </w:p>
-    <w:bookmarkEnd w:id="57"/>
-    <w:bookmarkStart w:id="58" w:name="inline-preview-panel-right"/>
+    <w:bookmarkEnd w:id="58"/>
+    <w:bookmarkStart w:id="59" w:name="inline-preview-panel-right"/>
     <w:p>
       <w:pPr>
         <w:pStyle w:val="Heading4"/>
@@ -9008,8 +9050,8 @@
         <w:t xml:space="preserve">block and the command counter incremented 7 → 8.</w:t>
       </w:r>
     </w:p>
-    <w:bookmarkEnd w:id="58"/>
-    <w:bookmarkStart w:id="59" w:name="quick-switch-panel-right-below-preview"/>
+    <w:bookmarkEnd w:id="59"/>
+    <w:bookmarkStart w:id="60" w:name="quick-switch-panel-right-below-preview"/>
     <w:p>
       <w:pPr>
         <w:pStyle w:val="Heading4"/>
@@ -9218,9 +9260,9 @@
         </w:pict>
       </w:r>
     </w:p>
-    <w:bookmarkEnd w:id="59"/>
     <w:bookmarkEnd w:id="60"/>
-    <w:bookmarkStart w:id="63" w:name="config-editor"/>
+    <w:bookmarkEnd w:id="61"/>
+    <w:bookmarkStart w:id="64" w:name="config-editor"/>
     <w:p>
       <w:pPr>
         <w:pStyle w:val="Heading3"/>
@@ -9328,7 +9370,7 @@
         <w:t xml:space="preserve">button.</w:t>
       </w:r>
     </w:p>
-    <w:bookmarkStart w:id="61" w:name="file-browser-left-panel-tree"/>
+    <w:bookmarkStart w:id="62" w:name="file-browser-left-panel-tree"/>
     <w:p>
       <w:pPr>
         <w:pStyle w:val="Heading4"/>
@@ -9726,8 +9768,8 @@
         <w:t xml:space="preserve">— 8h</w:t>
       </w:r>
     </w:p>
-    <w:bookmarkEnd w:id="61"/>
-    <w:bookmarkStart w:id="62" w:name="Xca6a7d7c89b1e773efb5feff9f474ce23ba3d62"/>
+    <w:bookmarkEnd w:id="62"/>
+    <w:bookmarkStart w:id="63" w:name="Xca6a7d7c89b1e773efb5feff9f474ce23ba3d62"/>
     <w:p>
       <w:pPr>
         <w:pStyle w:val="Heading4"/>
@@ -10062,6 +10104,365 @@
       </w:r>
       <w:r>
         <w:t xml:space="preserve">.</w:t>
+      </w:r>
+    </w:p>
+    <w:p>
+      <w:pPr>
+        <w:pStyle w:val="BlockText"/>
+      </w:pPr>
+      <w:r>
+        <w:rPr>
+          <w:bCs/>
+          <w:b/>
+        </w:rPr>
+        <w:t xml:space="preserve">✅ Current implementation status (this fork):</w:t>
+      </w:r>
+      <w:r>
+        <w:t xml:space="preserve"> </w:t>
+      </w:r>
+      <w:r>
+        <w:t xml:space="preserve">The Config Editor is fully built as a functional page. The component lives in</w:t>
+      </w:r>
+      <w:r>
+        <w:t xml:space="preserve"> </w:t>
+      </w:r>
+      <w:r>
+        <w:rPr>
+          <w:rStyle w:val="VerbatimChar"/>
+        </w:rPr>
+        <w:t xml:space="preserve">web/src/pages/config-editor-page.tsx</w:t>
+      </w:r>
+      <w:r>
+        <w:t xml:space="preserve"> </w:t>
+      </w:r>
+      <w:r>
+        <w:t xml:space="preserve">(exported as</w:t>
+      </w:r>
+      <w:r>
+        <w:t xml:space="preserve"> </w:t>
+      </w:r>
+      <w:r>
+        <w:rPr>
+          <w:rStyle w:val="VerbatimChar"/>
+        </w:rPr>
+        <w:t xml:space="preserve">ConfigEditorPage</w:t>
+      </w:r>
+      <w:r>
+        <w:t xml:space="preserve">) and is rendered from the</w:t>
+      </w:r>
+      <w:r>
+        <w:t xml:space="preserve"> </w:t>
+      </w:r>
+      <w:r>
+        <w:rPr>
+          <w:rStyle w:val="VerbatimChar"/>
+        </w:rPr>
+        <w:t xml:space="preserve">/servers/:id/config</w:t>
+      </w:r>
+      <w:r>
+        <w:t xml:space="preserve"> </w:t>
+      </w:r>
+      <w:r>
+        <w:t xml:space="preserve">route in</w:t>
+      </w:r>
+      <w:r>
+        <w:t xml:space="preserve"> </w:t>
+      </w:r>
+      <w:r>
+        <w:rPr>
+          <w:rStyle w:val="VerbatimChar"/>
+        </w:rPr>
+        <w:t xml:space="preserve">App.tsx</w:t>
+      </w:r>
+      <w:r>
+        <w:t xml:space="preserve">.</w:t>
+      </w:r>
+      <w:r>
+        <w:t xml:space="preserve"> </w:t>
+      </w:r>
+      <w:r>
+        <w:t xml:space="preserve">-</w:t>
+      </w:r>
+      <w:r>
+        <w:t xml:space="preserve"> </w:t>
+      </w:r>
+      <w:r>
+        <w:rPr>
+          <w:bCs/>
+          <w:b/>
+        </w:rPr>
+        <w:t xml:space="preserve">File browser tree</w:t>
+      </w:r>
+      <w:r>
+        <w:t xml:space="preserve">: Left sidebar (256px) with hierarchical tree view of config files. Mock data includes 7 files + 3 folders (gamemodes, matchzy, cs_sharp) with expand/collapse functionality. Each file shows</w:t>
+      </w:r>
+      <w:r>
+        <w:t xml:space="preserve"> </w:t>
+      </w:r>
+      <w:r>
+        <w:t xml:space="preserve">“</w:t>
+      </w:r>
+      <w:r>
+        <w:t xml:space="preserve">last modified</w:t>
+      </w:r>
+      <w:r>
+        <w:t xml:space="preserve">”</w:t>
+      </w:r>
+      <w:r>
+        <w:t xml:space="preserve"> </w:t>
+      </w:r>
+      <w:r>
+        <w:t xml:space="preserve">timestamp.</w:t>
+      </w:r>
+      <w:r>
+        <w:t xml:space="preserve"> </w:t>
+      </w:r>
+      <w:r>
+        <w:t xml:space="preserve">-</w:t>
+      </w:r>
+      <w:r>
+        <w:t xml:space="preserve"> </w:t>
+      </w:r>
+      <w:r>
+        <w:rPr>
+          <w:bCs/>
+          <w:b/>
+        </w:rPr>
+        <w:t xml:space="preserve">Code editor</w:t>
+      </w:r>
+      <w:r>
+        <w:t xml:space="preserve">: Full-width textarea with line numbers, monospace font, dark theme (bg-zinc-950). Supports multi-line editing with proper line height (1.5rem).</w:t>
+      </w:r>
+      <w:r>
+        <w:t xml:space="preserve"> </w:t>
+      </w:r>
+      <w:r>
+        <w:t xml:space="preserve">-</w:t>
+      </w:r>
+      <w:r>
+        <w:t xml:space="preserve"> </w:t>
+      </w:r>
+      <w:r>
+        <w:rPr>
+          <w:bCs/>
+          <w:b/>
+        </w:rPr>
+        <w:t xml:space="preserve">Unsaved changes tracking</w:t>
+      </w:r>
+      <w:r>
+        <w:t xml:space="preserve">: Compares current content with original content; shows amber</w:t>
+      </w:r>
+      <w:r>
+        <w:t xml:space="preserve"> </w:t>
+      </w:r>
+      <w:r>
+        <w:t xml:space="preserve">“</w:t>
+      </w:r>
+      <w:r>
+        <w:t xml:space="preserve">unsaved</w:t>
+      </w:r>
+      <w:r>
+        <w:t xml:space="preserve">”</w:t>
+      </w:r>
+      <w:r>
+        <w:t xml:space="preserve"> </w:t>
+      </w:r>
+      <w:r>
+        <w:t xml:space="preserve">badge when dirty.</w:t>
+      </w:r>
+      <w:r>
+        <w:t xml:space="preserve"> </w:t>
+      </w:r>
+      <w:r>
+        <w:t xml:space="preserve">“</w:t>
+      </w:r>
+      <w:r>
+        <w:t xml:space="preserve">Reload from disk</w:t>
+      </w:r>
+      <w:r>
+        <w:t xml:space="preserve">”</w:t>
+      </w:r>
+      <w:r>
+        <w:t xml:space="preserve"> </w:t>
+      </w:r>
+      <w:r>
+        <w:t xml:space="preserve">button resets to original content.</w:t>
+      </w:r>
+      <w:r>
+        <w:t xml:space="preserve"> </w:t>
+      </w:r>
+      <w:r>
+        <w:t xml:space="preserve">-</w:t>
+      </w:r>
+      <w:r>
+        <w:t xml:space="preserve"> </w:t>
+      </w:r>
+      <w:r>
+        <w:rPr>
+          <w:bCs/>
+          <w:b/>
+        </w:rPr>
+        <w:t xml:space="preserve">File operations</w:t>
+      </w:r>
+      <w:r>
+        <w:t xml:space="preserve">:</w:t>
+      </w:r>
+      <w:r>
+        <w:t xml:space="preserve"> </w:t>
+      </w:r>
+      <w:r>
+        <w:t xml:space="preserve">-</w:t>
+      </w:r>
+      <w:r>
+        <w:t xml:space="preserve"> </w:t>
+      </w:r>
+      <w:r>
+        <w:rPr>
+          <w:bCs/>
+          <w:b/>
+        </w:rPr>
+        <w:t xml:space="preserve">Save &amp; apply</w:t>
+      </w:r>
+      <w:r>
+        <w:t xml:space="preserve">: Saves file to server filesystem (TODO: backend integration)</w:t>
+      </w:r>
+      <w:r>
+        <w:t xml:space="preserve"> </w:t>
+      </w:r>
+      <w:r>
+        <w:t xml:space="preserve">-</w:t>
+      </w:r>
+      <w:r>
+        <w:t xml:space="preserve"> </w:t>
+      </w:r>
+      <w:r>
+        <w:rPr>
+          <w:bCs/>
+          <w:b/>
+        </w:rPr>
+        <w:t xml:space="preserve">Reload from disk</w:t>
+      </w:r>
+      <w:r>
+        <w:t xml:space="preserve">: Discards changes and reloads original content</w:t>
+      </w:r>
+      <w:r>
+        <w:t xml:space="preserve"> </w:t>
+      </w:r>
+      <w:r>
+        <w:t xml:space="preserve">-</w:t>
+      </w:r>
+      <w:r>
+        <w:t xml:space="preserve"> </w:t>
+      </w:r>
+      <w:r>
+        <w:rPr>
+          <w:bCs/>
+          <w:b/>
+        </w:rPr>
+        <w:t xml:space="preserve">exec via rcon</w:t>
+      </w:r>
+      <w:r>
+        <w:t xml:space="preserve">: Executes the file via RCON</w:t>
+      </w:r>
+      <w:r>
+        <w:t xml:space="preserve"> </w:t>
+      </w:r>
+      <w:r>
+        <w:rPr>
+          <w:rStyle w:val="VerbatimChar"/>
+        </w:rPr>
+        <w:t xml:space="preserve">exec &lt;filename&gt;</w:t>
+      </w:r>
+      <w:r>
+        <w:t xml:space="preserve"> </w:t>
+      </w:r>
+      <w:r>
+        <w:t xml:space="preserve">command</w:t>
+      </w:r>
+      <w:r>
+        <w:t xml:space="preserve"> </w:t>
+      </w:r>
+      <w:r>
+        <w:t xml:space="preserve">-</w:t>
+      </w:r>
+      <w:r>
+        <w:t xml:space="preserve"> </w:t>
+      </w:r>
+      <w:r>
+        <w:rPr>
+          <w:bCs/>
+          <w:b/>
+        </w:rPr>
+        <w:t xml:space="preserve">Header breadcrumb</w:t>
+      </w:r>
+      <w:r>
+        <w:t xml:space="preserve">: Shows full path</w:t>
+      </w:r>
+      <w:r>
+        <w:t xml:space="preserve"> </w:t>
+      </w:r>
+      <w:r>
+        <w:rPr>
+          <w:rStyle w:val="VerbatimChar"/>
+        </w:rPr>
+        <w:t xml:space="preserve">/home/cs2/server/csgo{selectedPath}</w:t>
+      </w:r>
+      <w:r>
+        <w:t xml:space="preserve"> </w:t>
+      </w:r>
+      <w:r>
+        <w:t xml:space="preserve">-</w:t>
+      </w:r>
+      <w:r>
+        <w:t xml:space="preserve"> </w:t>
+      </w:r>
+      <w:r>
+        <w:rPr>
+          <w:bCs/>
+          <w:b/>
+        </w:rPr>
+        <w:t xml:space="preserve">Footer status</w:t>
+      </w:r>
+      <w:r>
+        <w:t xml:space="preserve">: Displays encoding (utf-8), line endings (LF), line count, and last edit metadata</w:t>
+      </w:r>
+      <w:r>
+        <w:t xml:space="preserve"> </w:t>
+      </w:r>
+      <w:r>
+        <w:t xml:space="preserve">-</w:t>
+      </w:r>
+      <w:r>
+        <w:t xml:space="preserve"> </w:t>
+      </w:r>
+      <w:r>
+        <w:rPr>
+          <w:bCs/>
+          <w:b/>
+        </w:rPr>
+        <w:t xml:space="preserve">File selection</w:t>
+      </w:r>
+      <w:r>
+        <w:t xml:space="preserve">: Click any file in tree to load its content (currently shows demo content for all files)</w:t>
+      </w:r>
+      <w:r>
+        <w:t xml:space="preserve"> </w:t>
+      </w:r>
+      <w:r>
+        <w:t xml:space="preserve">-</w:t>
+      </w:r>
+      <w:r>
+        <w:t xml:space="preserve"> </w:t>
+      </w:r>
+      <w:r>
+        <w:rPr>
+          <w:bCs/>
+          <w:b/>
+        </w:rPr>
+        <w:t xml:space="preserve">TODO</w:t>
+      </w:r>
+      <w:r>
+        <w:t xml:space="preserve">: Real file loading from server, syntax highlighting for .cfg/.json, create new file functionality, backend integration for saving files to server filesystem</w:t>
       </w:r>
     </w:p>
     <w:p>
@@ -10071,9 +10472,9 @@
         </w:pict>
       </w:r>
     </w:p>
-    <w:bookmarkEnd w:id="62"/>
     <w:bookmarkEnd w:id="63"/>
-    <w:bookmarkStart w:id="68" w:name="plugins"/>
+    <w:bookmarkEnd w:id="64"/>
+    <w:bookmarkStart w:id="69" w:name="plugins"/>
     <w:p>
       <w:pPr>
         <w:pStyle w:val="Heading3"/>
@@ -10157,7 +10558,7 @@
         <w:t xml:space="preserve">.</w:t>
       </w:r>
     </w:p>
-    <w:bookmarkStart w:id="64" w:name="tabs-count-badges"/>
+    <w:bookmarkStart w:id="65" w:name="tabs-count-badges"/>
     <w:p>
       <w:pPr>
         <w:pStyle w:val="Heading4"/>
@@ -10213,8 +10614,8 @@
         <w:t xml:space="preserve">(Error log badge is red).</w:t>
       </w:r>
     </w:p>
-    <w:bookmarkEnd w:id="64"/>
-    <w:bookmarkStart w:id="65" w:name="installed-tab"/>
+    <w:bookmarkEnd w:id="65"/>
+    <w:bookmarkStart w:id="66" w:name="installed-tab"/>
     <w:p>
       <w:pPr>
         <w:pStyle w:val="Heading4"/>
@@ -10681,8 +11082,8 @@
         <w:t xml:space="preserve">.</w:t>
       </w:r>
     </w:p>
-    <w:bookmarkEnd w:id="65"/>
-    <w:bookmarkStart w:id="66" w:name="browse-tab-plugin-registry-marketplace"/>
+    <w:bookmarkEnd w:id="66"/>
+    <w:bookmarkStart w:id="67" w:name="browse-tab-plugin-registry-marketplace"/>
     <w:p>
       <w:pPr>
         <w:pStyle w:val="Heading4"/>
@@ -11164,8 +11565,8 @@
         <w:t xml:space="preserve">”</w:t>
       </w:r>
     </w:p>
-    <w:bookmarkEnd w:id="66"/>
-    <w:bookmarkStart w:id="67" w:name="error-log-tab"/>
+    <w:bookmarkEnd w:id="67"/>
+    <w:bookmarkStart w:id="68" w:name="error-log-tab"/>
     <w:p>
       <w:pPr>
         <w:pStyle w:val="Heading4"/>
@@ -11447,9 +11848,9 @@
         </w:pict>
       </w:r>
     </w:p>
-    <w:bookmarkEnd w:id="67"/>
     <w:bookmarkEnd w:id="68"/>
-    <w:bookmarkStart w:id="73" w:name="scheduler"/>
+    <w:bookmarkEnd w:id="69"/>
+    <w:bookmarkStart w:id="74" w:name="scheduler"/>
     <w:p>
       <w:pPr>
         <w:pStyle w:val="Heading3"/>
@@ -11521,7 +11922,7 @@
         <w:t xml:space="preserve">.</w:t>
       </w:r>
     </w:p>
-    <w:bookmarkStart w:id="69" w:name="jobs-table-left-main"/>
+    <w:bookmarkStart w:id="70" w:name="jobs-table-left-main"/>
     <w:p>
       <w:pPr>
         <w:pStyle w:val="Heading4"/>
@@ -11806,8 +12207,8 @@
         <w:t xml:space="preserve">| 2026-05-16 19:00 | 2026-05-23 19:00 (disabled) |</w:t>
       </w:r>
     </w:p>
-    <w:bookmarkEnd w:id="69"/>
-    <w:bookmarkStart w:id="70" w:name="recent-runs-table-below-jobs"/>
+    <w:bookmarkEnd w:id="70"/>
+    <w:bookmarkStart w:id="71" w:name="recent-runs-table-below-jobs"/>
     <w:p>
       <w:pPr>
         <w:pStyle w:val="Heading4"/>
@@ -11920,8 +12321,8 @@
         <w:t xml:space="preserve">| 19:00 (Fri) | Pug auto-shuffle | — | disabled (grey) |</w:t>
       </w:r>
     </w:p>
-    <w:bookmarkEnd w:id="70"/>
-    <w:bookmarkStart w:id="71" w:name="presets-panel-right"/>
+    <w:bookmarkEnd w:id="71"/>
+    <w:bookmarkStart w:id="72" w:name="presets-panel-right"/>
     <w:p>
       <w:pPr>
         <w:pStyle w:val="Heading4"/>
@@ -12026,8 +12427,8 @@
         <w:t xml:space="preserve">on-event down → webhook discord_alerts</w:t>
       </w:r>
     </w:p>
-    <w:bookmarkEnd w:id="71"/>
-    <w:bookmarkStart w:id="72" w:name="next-24h-panel-right-below-presets"/>
+    <w:bookmarkEnd w:id="72"/>
+    <w:bookmarkStart w:id="73" w:name="next-24h-panel-right-below-presets"/>
     <w:p>
       <w:pPr>
         <w:pStyle w:val="Heading4"/>
@@ -12148,9 +12549,9 @@
         </w:pict>
       </w:r>
     </w:p>
-    <w:bookmarkEnd w:id="72"/>
     <w:bookmarkEnd w:id="73"/>
-    <w:bookmarkStart w:id="79" w:name="admin"/>
+    <w:bookmarkEnd w:id="74"/>
+    <w:bookmarkStart w:id="80" w:name="admin"/>
     <w:p>
       <w:pPr>
         <w:pStyle w:val="Heading3"/>
@@ -12222,7 +12623,7 @@
         <w:t xml:space="preserve">.</w:t>
       </w:r>
     </w:p>
-    <w:bookmarkStart w:id="74" w:name="tabs"/>
+    <w:bookmarkStart w:id="75" w:name="tabs"/>
     <w:p>
       <w:pPr>
         <w:pStyle w:val="Heading4"/>
@@ -12290,8 +12691,8 @@
         <w:t xml:space="preserve">.</w:t>
       </w:r>
     </w:p>
-    <w:bookmarkEnd w:id="74"/>
-    <w:bookmarkStart w:id="75" w:name="users-roles-tab"/>
+    <w:bookmarkEnd w:id="75"/>
+    <w:bookmarkStart w:id="76" w:name="users-roles-tab"/>
     <w:p>
       <w:pPr>
         <w:pStyle w:val="Heading4"/>
@@ -12480,8 +12881,8 @@
         <w:t xml:space="preserve">| manage servers | ✓ | · | · |</w:t>
       </w:r>
     </w:p>
-    <w:bookmarkEnd w:id="75"/>
-    <w:bookmarkStart w:id="76" w:name="audit-log-tab"/>
+    <w:bookmarkEnd w:id="76"/>
+    <w:bookmarkStart w:id="77" w:name="audit-log-tab"/>
     <w:p>
       <w:pPr>
         <w:pStyle w:val="Heading4"/>
@@ -12726,8 +13127,8 @@
         <w:t xml:space="preserve">| 12:02:11 | m0use@ | signin | from 84.124.221.9 — chrome/macOS | ✓ |</w:t>
       </w:r>
     </w:p>
-    <w:bookmarkEnd w:id="76"/>
-    <w:bookmarkStart w:id="77" w:name="integrations-tab-4-cards"/>
+    <w:bookmarkEnd w:id="77"/>
+    <w:bookmarkStart w:id="78" w:name="integrations-tab-4-cards"/>
     <w:p>
       <w:pPr>
         <w:pStyle w:val="Heading4"/>
@@ -13177,8 +13578,8 @@
         <w:t xml:space="preserve">03:00 · 412 MB · ok</w:t>
       </w:r>
     </w:p>
-    <w:bookmarkEnd w:id="77"/>
-    <w:bookmarkStart w:id="78" w:name="gotv-demos-tab"/>
+    <w:bookmarkEnd w:id="78"/>
+    <w:bookmarkStart w:id="79" w:name="gotv-demos-tab"/>
     <w:p>
       <w:pPr>
         <w:pStyle w:val="Heading4"/>
@@ -13432,9 +13833,9 @@
         </w:pict>
       </w:r>
     </w:p>
-    <w:bookmarkEnd w:id="78"/>
     <w:bookmarkEnd w:id="79"/>
-    <w:bookmarkStart w:id="80" w:name="multi-server-switcher"/>
+    <w:bookmarkEnd w:id="80"/>
+    <w:bookmarkStart w:id="81" w:name="multi-server-switcher"/>
     <w:p>
       <w:pPr>
         <w:pStyle w:val="Heading3"/>
@@ -13665,8 +14066,8 @@
         </w:pict>
       </w:r>
     </w:p>
-    <w:bookmarkEnd w:id="80"/>
-    <w:bookmarkStart w:id="81" w:name="login-auth-session"/>
+    <w:bookmarkEnd w:id="81"/>
+    <w:bookmarkStart w:id="82" w:name="login-auth-session"/>
     <w:p>
       <w:pPr>
         <w:pStyle w:val="Heading3"/>
@@ -14009,8 +14410,8 @@
         </w:pict>
       </w:r>
     </w:p>
-    <w:bookmarkEnd w:id="81"/>
-    <w:bookmarkStart w:id="82" w:name="global-search-command-palette"/>
+    <w:bookmarkEnd w:id="82"/>
+    <w:bookmarkStart w:id="83" w:name="global-search-command-palette"/>
     <w:p>
       <w:pPr>
         <w:pStyle w:val="Heading3"/>
@@ -14126,9 +14527,9 @@
         </w:pict>
       </w:r>
     </w:p>
-    <w:bookmarkEnd w:id="82"/>
     <w:bookmarkEnd w:id="83"/>
-    <w:bookmarkStart w:id="84" w:name="Xb3dc79d59a5ce2f8117aa7a57871f6dd7183cb9"/>
+    <w:bookmarkEnd w:id="84"/>
+    <w:bookmarkStart w:id="85" w:name="Xb3dc79d59a5ce2f8117aa7a57871f6dd7183cb9"/>
     <w:p>
       <w:pPr>
         <w:pStyle w:val="Heading2"/>
@@ -14618,8 +15019,8 @@
         <w:t xml:space="preserve">This document was compiled from observations of the nokit demo. Keep it updated as features move from ❌ (demo/planned) to ✅ (implemented).</w:t>
       </w:r>
     </w:p>
-    <w:bookmarkEnd w:id="84"/>
     <w:bookmarkEnd w:id="85"/>
+    <w:bookmarkEnd w:id="86"/>
     <w:sectPr/>
   </w:body>
 </w:document>

</xml_diff>

<commit_message>
docs: document two-mode workshop maps (README, featureDetail, compose example)
</commit_message>
<xml_diff>
--- a/featureDetail.docx
+++ b/featureDetail.docx
@@ -902,7 +902,50 @@
               <w:jc w:val="left"/>
             </w:pPr>
             <w:r>
-              <w:t xml:space="preserve">Standard map pool (12 maps), favorites system (localStorage), workshop maps fetched live via RCON (</w:t>
+              <w:t xml:space="preserve">Standard map pool (12 maps), favorites system (localStorage),</w:t>
+            </w:r>
+            <w:r>
+              <w:t xml:space="preserve"> </w:t>
+            </w:r>
+            <w:r>
+              <w:rPr>
+                <w:bCs/>
+                <w:b/>
+              </w:rPr>
+              <w:t xml:space="preserve">two-mode workshop map management</w:t>
+            </w:r>
+            <w:r>
+              <w:t xml:space="preserve"> </w:t>
+            </w:r>
+            <w:r>
+              <w:t xml:space="preserve">(</w:t>
+            </w:r>
+            <w:r>
+              <w:rPr>
+                <w:rStyle w:val="VerbatimChar"/>
+              </w:rPr>
+              <w:t xml:space="preserve">internal/workshop</w:t>
+            </w:r>
+            <w:r>
+              <w:t xml:space="preserve">) — Mode A (default) lists installed maps via RCON</w:t>
+            </w:r>
+            <w:r>
+              <w:t xml:space="preserve"> </w:t>
+            </w:r>
+            <w:r>
+              <w:rPr>
+                <w:rStyle w:val="VerbatimChar"/>
+              </w:rPr>
+              <w:t xml:space="preserve">ds_workshop_listmaps</w:t>
+            </w:r>
+            <w:r>
+              <w:t xml:space="preserve"> </w:t>
+            </w:r>
+            <w:r>
+              <w:t xml:space="preserve">(fallback</w:t>
+            </w:r>
+            <w:r>
+              <w:t xml:space="preserve"> </w:t>
             </w:r>
             <w:r>
               <w:rPr>
@@ -911,10 +954,7 @@
               <w:t xml:space="preserve">maps *</w:t>
             </w:r>
             <w:r>
-              <w:t xml:space="preserve"> </w:t>
-            </w:r>
-            <w:r>
-              <w:t xml:space="preserve">→</w:t>
+              <w:t xml:space="preserve">) →</w:t>
             </w:r>
             <w:r>
               <w:t xml:space="preserve"> </w:t>
@@ -926,7 +966,49 @@
               <w:t xml:space="preserve">GET /api/servers/{id}/maps/workshop</w:t>
             </w:r>
             <w:r>
-              <w:t xml:space="preserve">), workshop map thumbnails via the Steam Web API (</w:t>
+              <w:t xml:space="preserve">, resolving workshop IDs from a DB cache (</w:t>
+            </w:r>
+            <w:r>
+              <w:rPr>
+                <w:rStyle w:val="VerbatimChar"/>
+              </w:rPr>
+              <w:t xml:space="preserve">workshop_maps</w:t>
+            </w:r>
+            <w:r>
+              <w:t xml:space="preserve">) populated when maps are loaded through the panel; Mode B (opt-in, when a volume is mounted at</w:t>
+            </w:r>
+            <w:r>
+              <w:t xml:space="preserve"> </w:t>
+            </w:r>
+            <w:r>
+              <w:rPr>
+                <w:rStyle w:val="VerbatimChar"/>
+              </w:rPr>
+              <w:t xml:space="preserve">/workshop/&lt;serverId&gt;</w:t>
+            </w:r>
+            <w:r>
+              <w:t xml:space="preserve">) scans the filesystem for exact ID↔name mapping incl. multiple versions, with runtime write-probed uninstall (</w:t>
+            </w:r>
+            <w:r>
+              <w:rPr>
+                <w:rStyle w:val="VerbatimChar"/>
+              </w:rPr>
+              <w:t xml:space="preserve">DELETE /api/servers/{id}/maps/workshop/{id}</w:t>
+            </w:r>
+            <w:r>
+              <w:t xml:space="preserve">). Load endpoint</w:t>
+            </w:r>
+            <w:r>
+              <w:t xml:space="preserve"> </w:t>
+            </w:r>
+            <w:r>
+              <w:rPr>
+                <w:rStyle w:val="VerbatimChar"/>
+              </w:rPr>
+              <w:t xml:space="preserve">POST /api/servers/{id}/maps/workshop/load</w:t>
+            </w:r>
+            <w:r>
+              <w:t xml:space="preserve">. Workshop map thumbnails via the Steam Web API (</w:t>
             </w:r>
             <w:r>
               <w:rPr>
@@ -10439,10 +10521,98 @@
           <w:bCs/>
           <w:b/>
         </w:rPr>
-        <w:t xml:space="preserve">Workshop maps</w:t>
-      </w:r>
-      <w:r>
-        <w:t xml:space="preserve">: Installed workshop maps are fetched live from the server via RCON (</w:t>
+        <w:t xml:space="preserve">Workshop maps (two-mode management)</w:t>
+      </w:r>
+      <w:r>
+        <w:t xml:space="preserve">: Installed workshop maps are listed through</w:t>
+      </w:r>
+      <w:r>
+        <w:t xml:space="preserve"> </w:t>
+      </w:r>
+      <w:r>
+        <w:rPr>
+          <w:rStyle w:val="VerbatimChar"/>
+        </w:rPr>
+        <w:t xml:space="preserve">GET /api/servers/:id/maps/workshop</w:t>
+      </w:r>
+      <w:r>
+        <w:t xml:space="preserve">, which returns</w:t>
+      </w:r>
+      <w:r>
+        <w:t xml:space="preserve"> </w:t>
+      </w:r>
+      <w:r>
+        <w:rPr>
+          <w:rStyle w:val="VerbatimChar"/>
+        </w:rPr>
+        <w:t xml:space="preserve">{mode, writable, maps[]}</w:t>
+      </w:r>
+      <w:r>
+        <w:t xml:space="preserve">. The backend logic lives in the</w:t>
+      </w:r>
+      <w:r>
+        <w:t xml:space="preserve"> </w:t>
+      </w:r>
+      <w:r>
+        <w:rPr>
+          <w:rStyle w:val="VerbatimChar"/>
+        </w:rPr>
+        <w:t xml:space="preserve">internal/workshop</w:t>
+      </w:r>
+      <w:r>
+        <w:t xml:space="preserve"> </w:t>
+      </w:r>
+      <w:r>
+        <w:t xml:space="preserve">package (</w:t>
+      </w:r>
+      <w:r>
+        <w:rPr>
+          <w:rStyle w:val="VerbatimChar"/>
+        </w:rPr>
+        <w:t xml:space="preserve">Resolve()</w:t>
+      </w:r>
+      <w:r>
+        <w:t xml:space="preserve"> </w:t>
+      </w:r>
+      <w:r>
+        <w:t xml:space="preserve">picks the provider per server at request time):</w:t>
+      </w:r>
+      <w:r>
+        <w:t xml:space="preserve"> </w:t>
+      </w:r>
+      <w:r>
+        <w:t xml:space="preserve">-</w:t>
+      </w:r>
+      <w:r>
+        <w:t xml:space="preserve"> </w:t>
+      </w:r>
+      <w:r>
+        <w:rPr>
+          <w:bCs/>
+          <w:b/>
+        </w:rPr>
+        <w:t xml:space="preserve">Mode A — RCON + DB cache (default)</w:t>
+      </w:r>
+      <w:r>
+        <w:t xml:space="preserve">: lists installed maps via RCON</w:t>
+      </w:r>
+      <w:r>
+        <w:t xml:space="preserve"> </w:t>
+      </w:r>
+      <w:r>
+        <w:rPr>
+          <w:rStyle w:val="VerbatimChar"/>
+        </w:rPr>
+        <w:t xml:space="preserve">ds_workshop_listmaps</w:t>
+      </w:r>
+      <w:r>
+        <w:t xml:space="preserve"> </w:t>
+      </w:r>
+      <w:r>
+        <w:t xml:space="preserve">(falling back to</w:t>
+      </w:r>
+      <w:r>
+        <w:t xml:space="preserve"> </w:t>
       </w:r>
       <w:r>
         <w:rPr>
@@ -10451,34 +10621,271 @@
         <w:t xml:space="preserve">maps *</w:t>
       </w:r>
       <w:r>
-        <w:t xml:space="preserve">) through</w:t>
-      </w:r>
-      <w:r>
-        <w:t xml:space="preserve"> </w:t>
-      </w:r>
-      <w:r>
-        <w:rPr>
-          <w:rStyle w:val="VerbatimChar"/>
-        </w:rPr>
-        <w:t xml:space="preserve">GET /api/servers/:id/maps/workshop</w:t>
-      </w:r>
-      <w:r>
-        <w:t xml:space="preserve">. Users can input a workshop ID and load it via RCON</w:t>
-      </w:r>
-      <w:r>
-        <w:t xml:space="preserve"> </w:t>
-      </w:r>
-      <w:r>
-        <w:rPr>
-          <w:rStyle w:val="VerbatimChar"/>
-        </w:rPr>
-        <w:t xml:space="preserve">host_workshop_map &lt;workshopid&gt;</w:t>
-      </w:r>
-      <w:r>
-        <w:t xml:space="preserve"> </w:t>
-      </w:r>
-      <w:r>
-        <w:t xml:space="preserve">command.</w:t>
+        <w:t xml:space="preserve">), which returns bare map</w:t>
+      </w:r>
+      <w:r>
+        <w:t xml:space="preserve"> </w:t>
+      </w:r>
+      <w:r>
+        <w:rPr>
+          <w:bCs/>
+          <w:b/>
+        </w:rPr>
+        <w:t xml:space="preserve">names</w:t>
+      </w:r>
+      <w:r>
+        <w:t xml:space="preserve"> </w:t>
+      </w:r>
+      <w:r>
+        <w:t xml:space="preserve">only. Workshop IDs are resolved from the SQLite</w:t>
+      </w:r>
+      <w:r>
+        <w:t xml:space="preserve"> </w:t>
+      </w:r>
+      <w:r>
+        <w:rPr>
+          <w:rStyle w:val="VerbatimChar"/>
+        </w:rPr>
+        <w:t xml:space="preserve">workshop_maps</w:t>
+      </w:r>
+      <w:r>
+        <w:t xml:space="preserve"> </w:t>
+      </w:r>
+      <w:r>
+        <w:t xml:space="preserve">cache, populated when a map is loaded through the panel (</w:t>
+      </w:r>
+      <w:r>
+        <w:rPr>
+          <w:rStyle w:val="VerbatimChar"/>
+        </w:rPr>
+        <w:t xml:space="preserve">POST /api/servers/:id/maps/workshop/load</w:t>
+      </w:r>
+      <w:r>
+        <w:t xml:space="preserve"> </w:t>
+      </w:r>
+      <w:r>
+        <w:t xml:space="preserve">runs</w:t>
+      </w:r>
+      <w:r>
+        <w:t xml:space="preserve"> </w:t>
+      </w:r>
+      <w:r>
+        <w:rPr>
+          <w:rStyle w:val="VerbatimChar"/>
+        </w:rPr>
+        <w:t xml:space="preserve">host_workshop_map &lt;id&gt;</w:t>
+      </w:r>
+      <w:r>
+        <w:t xml:space="preserve"> </w:t>
+      </w:r>
+      <w:r>
+        <w:t xml:space="preserve">and, after confirming the loaded name from</w:t>
+      </w:r>
+      <w:r>
+        <w:t xml:space="preserve"> </w:t>
+      </w:r>
+      <w:r>
+        <w:rPr>
+          <w:rStyle w:val="VerbatimChar"/>
+        </w:rPr>
+        <w:t xml:space="preserve">status</w:t>
+      </w:r>
+      <w:r>
+        <w:t xml:space="preserve">, upserts the</w:t>
+      </w:r>
+      <w:r>
+        <w:t xml:space="preserve"> </w:t>
+      </w:r>
+      <w:r>
+        <w:rPr>
+          <w:rStyle w:val="VerbatimChar"/>
+        </w:rPr>
+        <w:t xml:space="preserve">id → name</w:t>
+      </w:r>
+      <w:r>
+        <w:t xml:space="preserve"> </w:t>
+      </w:r>
+      <w:r>
+        <w:t xml:space="preserve">mapping). Maps with a cached ID show a thumbnail +</w:t>
+      </w:r>
+      <w:r>
+        <w:t xml:space="preserve"> </w:t>
+      </w:r>
+      <w:r>
+        <w:rPr>
+          <w:rStyle w:val="VerbatimChar"/>
+        </w:rPr>
+        <w:t xml:space="preserve">instant</w:t>
+      </w:r>
+      <w:r>
+        <w:t xml:space="preserve"> </w:t>
+      </w:r>
+      <w:r>
+        <w:t xml:space="preserve">badge; maps without one show a clean</w:t>
+      </w:r>
+      <w:r>
+        <w:t xml:space="preserve"> </w:t>
+      </w:r>
+      <w:r>
+        <w:rPr>
+          <w:rStyle w:val="VerbatimChar"/>
+        </w:rPr>
+        <w:t xml:space="preserve">no id</w:t>
+      </w:r>
+      <w:r>
+        <w:t xml:space="preserve"> </w:t>
+      </w:r>
+      <w:r>
+        <w:t xml:space="preserve">card and are switched by name via</w:t>
+      </w:r>
+      <w:r>
+        <w:t xml:space="preserve"> </w:t>
+      </w:r>
+      <w:r>
+        <w:rPr>
+          <w:rStyle w:val="VerbatimChar"/>
+        </w:rPr>
+        <w:t xml:space="preserve">ds_workshop_changelevel &lt;name&gt;</w:t>
+      </w:r>
+      <w:r>
+        <w:t xml:space="preserve">. Cannot disambiguate multiple versions sharing a name.</w:t>
+      </w:r>
+      <w:r>
+        <w:t xml:space="preserve"> </w:t>
+      </w:r>
+      <w:r>
+        <w:t xml:space="preserve">-</w:t>
+      </w:r>
+      <w:r>
+        <w:t xml:space="preserve"> </w:t>
+      </w:r>
+      <w:r>
+        <w:rPr>
+          <w:bCs/>
+          <w:b/>
+        </w:rPr>
+        <w:t xml:space="preserve">Mode B — filesystem scan (opt-in)</w:t>
+      </w:r>
+      <w:r>
+        <w:t xml:space="preserve">: activated automatically when a volume is mounted at</w:t>
+      </w:r>
+      <w:r>
+        <w:t xml:space="preserve"> </w:t>
+      </w:r>
+      <w:r>
+        <w:rPr>
+          <w:rStyle w:val="VerbatimChar"/>
+        </w:rPr>
+        <w:t xml:space="preserve">/workshop/&lt;serverId&gt;</w:t>
+      </w:r>
+      <w:r>
+        <w:t xml:space="preserve"> </w:t>
+      </w:r>
+      <w:r>
+        <w:t xml:space="preserve">(base</w:t>
+      </w:r>
+      <w:r>
+        <w:t xml:space="preserve"> </w:t>
+      </w:r>
+      <w:r>
+        <w:rPr>
+          <w:rStyle w:val="VerbatimChar"/>
+        </w:rPr>
+        <w:t xml:space="preserve">WORKSHOP_BASE</w:t>
+      </w:r>
+      <w:r>
+        <w:t xml:space="preserve">, default</w:t>
+      </w:r>
+      <w:r>
+        <w:t xml:space="preserve"> </w:t>
+      </w:r>
+      <w:r>
+        <w:rPr>
+          <w:rStyle w:val="VerbatimChar"/>
+        </w:rPr>
+        <w:t xml:space="preserve">/workshop</w:t>
+      </w:r>
+      <w:r>
+        <w:t xml:space="preserve">; per-server override</w:t>
+      </w:r>
+      <w:r>
+        <w:t xml:space="preserve"> </w:t>
+      </w:r>
+      <w:r>
+        <w:rPr>
+          <w:rStyle w:val="VerbatimChar"/>
+        </w:rPr>
+        <w:t xml:space="preserve">WORKSHOP_PATH_&lt;UPPER_ID&gt;</w:t>
+      </w:r>
+      <w:r>
+        <w:t xml:space="preserve">). Scans numeric</w:t>
+      </w:r>
+      <w:r>
+        <w:t xml:space="preserve"> </w:t>
+      </w:r>
+      <w:r>
+        <w:rPr>
+          <w:rStyle w:val="VerbatimChar"/>
+        </w:rPr>
+        <w:t xml:space="preserve">&lt;workshopId&gt;/*.vpk</w:t>
+      </w:r>
+      <w:r>
+        <w:t xml:space="preserve"> </w:t>
+      </w:r>
+      <w:r>
+        <w:t xml:space="preserve">subfolders for an exact ID↔name mapping including multiple versions grouped per card (</w:t>
+      </w:r>
+      <w:r>
+        <w:rPr>
+          <w:rStyle w:val="VerbatimChar"/>
+        </w:rPr>
+        <w:t xml:space="preserve">scanned</w:t>
+      </w:r>
+      <w:r>
+        <w:t xml:space="preserve"> </w:t>
+      </w:r>
+      <w:r>
+        <w:t xml:space="preserve">badge).</w:t>
+      </w:r>
+      <w:r>
+        <w:t xml:space="preserve"> </w:t>
+      </w:r>
+      <w:r>
+        <w:rPr>
+          <w:bCs/>
+          <w:b/>
+        </w:rPr>
+        <w:t xml:space="preserve">Uninstall</w:t>
+      </w:r>
+      <w:r>
+        <w:t xml:space="preserve"> </w:t>
+      </w:r>
+      <w:r>
+        <w:t xml:space="preserve">(</w:t>
+      </w:r>
+      <w:r>
+        <w:rPr>
+          <w:rStyle w:val="VerbatimChar"/>
+        </w:rPr>
+        <w:t xml:space="preserve">DELETE /api/servers/:id/maps/workshop/{id}</w:t>
+      </w:r>
+      <w:r>
+        <w:t xml:space="preserve">) is offered only in Mode B and only when the mount is writable — writability is auto-detected at runtime by a write-probe (create+delete a temp file), never a config flag. Mount</w:t>
+      </w:r>
+      <w:r>
+        <w:t xml:space="preserve"> </w:t>
+      </w:r>
+      <w:r>
+        <w:rPr>
+          <w:rStyle w:val="VerbatimChar"/>
+        </w:rPr>
+        <w:t xml:space="preserve">:ro</w:t>
+      </w:r>
+      <w:r>
+        <w:t xml:space="preserve"> </w:t>
+      </w:r>
+      <w:r>
+        <w:t xml:space="preserve">to keep uninstall disabled.</w:t>
       </w:r>
       <w:r>
         <w:t xml:space="preserve"> </w:t>

</xml_diff>